<commit_message>
harden production launch and App Store release
</commit_message>
<xml_diff>
--- a/docs/app-review/NeuroTrader_App_Review_Response.docx
+++ b/docs/app-review/NeuroTrader_App_Review_Response.docx
@@ -4,51 +4,10 @@
   <w:body>
     <w:p>
       <w:pPr>
-        <w:spacing w:after="140"/>
-        <w:jc w:val="left"/>
+        <w:pStyle w:val="Title"/>
       </w:pPr>
       <w:r>
-        <w:drawing>
-          <wp:inline xmlns:a="http://schemas.openxmlformats.org/drawingml/2006/main" xmlns:pic="http://schemas.openxmlformats.org/drawingml/2006/picture">
-            <wp:extent cx="2468880" cy="391308"/>
-            <wp:docPr id="1" name="Picture 1" title="NeuroTrader" descr="NeuroTrader logo"/>
-            <wp:cNvGraphicFramePr>
-              <a:graphicFrameLocks noChangeAspect="1"/>
-            </wp:cNvGraphicFramePr>
-            <a:graphic>
-              <a:graphicData uri="http://schemas.openxmlformats.org/drawingml/2006/picture">
-                <pic:pic>
-                  <pic:nvPicPr>
-                    <pic:cNvPr id="0" name="neurotrader-logo-web.png"/>
-                    <pic:cNvPicPr/>
-                  </pic:nvPicPr>
-                  <pic:blipFill>
-                    <a:blip r:embed="rId15"/>
-                    <a:stretch>
-                      <a:fillRect/>
-                    </a:stretch>
-                  </pic:blipFill>
-                  <pic:spPr>
-                    <a:xfrm>
-                      <a:off x="0" y="0"/>
-                      <a:ext cx="2468880" cy="391308"/>
-                    </a:xfrm>
-                    <a:prstGeom prst="rect"/>
-                  </pic:spPr>
-                </pic:pic>
-              </a:graphicData>
-            </a:graphic>
-          </wp:inline>
-        </w:drawing>
-      </w:r>
-    </w:p>
-    <w:p>
-      <w:pPr>
-        <w:pStyle w:val="Title"/>
-        <w:keepNext/>
-      </w:pPr>
-      <w:r>
-        <w:t>NeuroTrader App Review Response</w:t>
+        <w:t>App Review Response and Access Guide</w:t>
       </w:r>
     </w:p>
     <w:p>
@@ -57,906 +16,190 @@
       </w:pPr>
       <w:r>
         <w:rPr>
-          <w:rFonts w:ascii="Aptos" w:hAnsi="Aptos"/>
-          <w:color w:val="667085"/>
-          <w:sz w:val="24"/>
+          <w:b/>
+          <w:color w:val="475569"/>
         </w:rPr>
-        <w:t>Response to the six information requests from Apple App Review</w:t>
+        <w:t>Submitted by SG PAX Corp for Neuro Trader iOS version 1.0.0 build 5</w:t>
+      </w:r>
+    </w:p>
+    <w:p>
+      <w:r>
+        <w:rPr>
+          <w:b/>
+        </w:rPr>
+        <w:t xml:space="preserve">To Apple App Review: </w:t>
+      </w:r>
+      <w:r>
+        <w:t>This document answers the six requested review items and provides the exact access path for the submitted iOS app. The iOS app supports sign-in to an existing NeuroTrader membership but does not offer account registration, pricing, checkout, subscription purchase, upgrade, or an external purchase link.</w:t>
       </w:r>
     </w:p>
     <w:tbl>
       <w:tblPr>
-        <w:tblStyle w:val="TableGrid"/>
         <w:tblW w:type="auto" w:w="0"/>
         <w:jc w:val="center"/>
         <w:tblLayout w:type="fixed"/>
         <w:tblLook w:firstColumn="1" w:firstRow="1" w:lastColumn="0" w:lastRow="0" w:noHBand="0" w:noVBand="1" w:val="04A0"/>
-        <w:tblBorders>
-          <w:top w:val="single" w:sz="6" w:space="0" w:color="D9D9D9"/>
-          <w:left w:val="single" w:sz="6" w:space="0" w:color="D9D9D9"/>
-          <w:bottom w:val="single" w:sz="6" w:space="0" w:color="D9D9D9"/>
-          <w:right w:val="single" w:sz="6" w:space="0" w:color="D9D9D9"/>
-          <w:insideH w:val="single" w:sz="6" w:space="0" w:color="D9D9D9"/>
-          <w:insideV w:val="single" w:sz="6" w:space="0" w:color="D9D9D9"/>
-        </w:tblBorders>
       </w:tblPr>
       <w:tblGrid>
-        <w:gridCol w:w="2376"/>
-        <w:gridCol w:w="7560"/>
+        <w:gridCol w:w="2952"/>
+        <w:gridCol w:w="7200"/>
       </w:tblGrid>
       <w:tr>
-        <w:trPr>
-          <w:cantSplit/>
-          <w:tblHeader w:val="true"/>
-        </w:trPr>
         <w:tc>
           <w:tcPr>
-            <w:tcW w:type="dxa" w:w="2376"/>
+            <w:tcW w:type="dxa" w:w="5112"/>
             <w:vAlign w:val="center"/>
             <w:tcMar>
-              <w:top w:w="110" w:type="dxa"/>
-              <w:start w:w="130" w:type="dxa"/>
-              <w:bottom w:w="110" w:type="dxa"/>
-              <w:end w:w="130" w:type="dxa"/>
+              <w:top w:w="100" w:type="dxa"/>
+              <w:start w:w="120" w:type="dxa"/>
+              <w:bottom w:w="100" w:type="dxa"/>
+              <w:end w:w="120" w:type="dxa"/>
             </w:tcMar>
-            <w:shd w:fill="17324D"/>
+            <w:shd w:fill="ECFDF5"/>
           </w:tcPr>
           <w:p>
             <w:r>
               <w:rPr>
-                <w:rFonts w:ascii="Arial" w:hAnsi="Arial"/>
                 <w:b/>
-                <w:color w:val="0B172A"/>
-                <w:sz w:val="18"/>
               </w:rPr>
-              <w:t>Submission field</w:t>
+              <w:t>App purpose</w:t>
             </w:r>
           </w:p>
         </w:tc>
         <w:tc>
           <w:tcPr>
-            <w:tcW w:type="dxa" w:w="7560"/>
+            <w:tcW w:type="dxa" w:w="5112"/>
             <w:vAlign w:val="center"/>
             <w:tcMar>
-              <w:top w:w="110" w:type="dxa"/>
-              <w:start w:w="130" w:type="dxa"/>
-              <w:bottom w:w="110" w:type="dxa"/>
-              <w:end w:w="130" w:type="dxa"/>
+              <w:top w:w="100" w:type="dxa"/>
+              <w:start w:w="120" w:type="dxa"/>
+              <w:bottom w:w="100" w:type="dxa"/>
+              <w:end w:w="120" w:type="dxa"/>
             </w:tcMar>
-            <w:shd w:fill="17324D"/>
           </w:tcPr>
           <w:p>
             <w:r>
-              <w:rPr>
-                <w:rFonts w:ascii="Arial" w:hAnsi="Arial"/>
-                <w:b/>
-                <w:color w:val="0B172A"/>
-                <w:sz w:val="18"/>
-              </w:rPr>
-              <w:t>Information</w:t>
+              <w:t>Private trading-business planning, journaling, risk controls, analytics, simulation, and educational AI reflection</w:t>
             </w:r>
           </w:p>
         </w:tc>
       </w:tr>
       <w:tr>
-        <w:trPr>
-          <w:cantSplit/>
-        </w:trPr>
         <w:tc>
           <w:tcPr>
-            <w:tcW w:type="dxa" w:w="2376"/>
+            <w:tcW w:type="dxa" w:w="5112"/>
             <w:vAlign w:val="center"/>
             <w:tcMar>
-              <w:top w:w="110" w:type="dxa"/>
-              <w:start w:w="130" w:type="dxa"/>
-              <w:bottom w:w="110" w:type="dxa"/>
-              <w:end w:w="130" w:type="dxa"/>
+              <w:top w:w="100" w:type="dxa"/>
+              <w:start w:w="120" w:type="dxa"/>
+              <w:bottom w:w="100" w:type="dxa"/>
+              <w:end w:w="120" w:type="dxa"/>
             </w:tcMar>
+            <w:shd w:fill="ECFDF5"/>
           </w:tcPr>
           <w:p>
             <w:r>
               <w:rPr>
-                <w:rFonts w:ascii="Arial" w:hAnsi="Arial"/>
-                <w:color w:val="0B172A"/>
-                <w:sz w:val="18"/>
+                <w:b/>
               </w:rPr>
-              <w:t>From</w:t>
+              <w:t>Target audience</w:t>
             </w:r>
           </w:p>
         </w:tc>
         <w:tc>
           <w:tcPr>
-            <w:tcW w:type="dxa" w:w="7560"/>
+            <w:tcW w:type="dxa" w:w="5112"/>
             <w:vAlign w:val="center"/>
             <w:tcMar>
-              <w:top w:w="110" w:type="dxa"/>
-              <w:start w:w="130" w:type="dxa"/>
-              <w:bottom w:w="110" w:type="dxa"/>
-              <w:end w:w="130" w:type="dxa"/>
+              <w:top w:w="100" w:type="dxa"/>
+              <w:start w:w="120" w:type="dxa"/>
+              <w:bottom w:w="100" w:type="dxa"/>
+              <w:end w:w="120" w:type="dxa"/>
             </w:tcMar>
           </w:tcPr>
           <w:p>
             <w:r>
-              <w:rPr>
-                <w:rFonts w:ascii="Arial" w:hAnsi="Arial"/>
-                <w:color w:val="0B172A"/>
-                <w:sz w:val="18"/>
-              </w:rPr>
-              <w:t>SG PAX CORP.</w:t>
+              <w:t>Self-directed traders operating their activity as a measurable business</w:t>
             </w:r>
           </w:p>
         </w:tc>
       </w:tr>
       <w:tr>
-        <w:trPr>
-          <w:cantSplit/>
-        </w:trPr>
         <w:tc>
           <w:tcPr>
-            <w:tcW w:type="dxa" w:w="2376"/>
+            <w:tcW w:type="dxa" w:w="5112"/>
             <w:vAlign w:val="center"/>
             <w:tcMar>
-              <w:top w:w="110" w:type="dxa"/>
-              <w:start w:w="130" w:type="dxa"/>
-              <w:bottom w:w="110" w:type="dxa"/>
-              <w:end w:w="130" w:type="dxa"/>
+              <w:top w:w="100" w:type="dxa"/>
+              <w:start w:w="120" w:type="dxa"/>
+              <w:bottom w:w="100" w:type="dxa"/>
+              <w:end w:w="120" w:type="dxa"/>
             </w:tcMar>
-            <w:shd w:fill="F5F7F9"/>
+            <w:shd w:fill="ECFDF5"/>
           </w:tcPr>
           <w:p>
             <w:r>
               <w:rPr>
-                <w:rFonts w:ascii="Arial" w:hAnsi="Arial"/>
-                <w:color w:val="0B172A"/>
-                <w:sz w:val="18"/>
+                <w:b/>
               </w:rPr>
-              <w:t>Product</w:t>
+              <w:t>Commerce in iOS</w:t>
             </w:r>
           </w:p>
         </w:tc>
         <w:tc>
           <w:tcPr>
-            <w:tcW w:type="dxa" w:w="7560"/>
+            <w:tcW w:type="dxa" w:w="5112"/>
             <w:vAlign w:val="center"/>
             <w:tcMar>
-              <w:top w:w="110" w:type="dxa"/>
-              <w:start w:w="130" w:type="dxa"/>
-              <w:bottom w:w="110" w:type="dxa"/>
-              <w:end w:w="130" w:type="dxa"/>
+              <w:top w:w="100" w:type="dxa"/>
+              <w:start w:w="120" w:type="dxa"/>
+              <w:bottom w:w="100" w:type="dxa"/>
+              <w:end w:w="120" w:type="dxa"/>
             </w:tcMar>
-            <w:shd w:fill="F5F7F9"/>
           </w:tcPr>
           <w:p>
             <w:r>
-              <w:rPr>
-                <w:rFonts w:ascii="Arial" w:hAnsi="Arial"/>
-                <w:color w:val="0B172A"/>
-                <w:sz w:val="18"/>
-              </w:rPr>
-              <w:t>NeuroTrader</w:t>
+              <w:t>None. Memberships are managed outside the submitted app</w:t>
             </w:r>
           </w:p>
         </w:tc>
       </w:tr>
       <w:tr>
-        <w:trPr>
-          <w:cantSplit/>
-        </w:trPr>
         <w:tc>
           <w:tcPr>
-            <w:tcW w:type="dxa" w:w="2376"/>
+            <w:tcW w:type="dxa" w:w="5112"/>
             <w:vAlign w:val="center"/>
             <w:tcMar>
-              <w:top w:w="110" w:type="dxa"/>
-              <w:start w:w="130" w:type="dxa"/>
-              <w:bottom w:w="110" w:type="dxa"/>
-              <w:end w:w="130" w:type="dxa"/>
+              <w:top w:w="100" w:type="dxa"/>
+              <w:start w:w="120" w:type="dxa"/>
+              <w:bottom w:w="100" w:type="dxa"/>
+              <w:end w:w="120" w:type="dxa"/>
             </w:tcMar>
+            <w:shd w:fill="ECFDF5"/>
           </w:tcPr>
           <w:p>
             <w:r>
               <w:rPr>
-                <w:rFonts w:ascii="Arial" w:hAnsi="Arial"/>
-                <w:color w:val="0B172A"/>
-                <w:sz w:val="18"/>
+                <w:b/>
               </w:rPr>
-              <w:t>To</w:t>
+              <w:t>Trading activity</w:t>
             </w:r>
           </w:p>
         </w:tc>
         <w:tc>
           <w:tcPr>
-            <w:tcW w:type="dxa" w:w="7560"/>
+            <w:tcW w:type="dxa" w:w="5112"/>
             <w:vAlign w:val="center"/>
             <w:tcMar>
-              <w:top w:w="110" w:type="dxa"/>
-              <w:start w:w="130" w:type="dxa"/>
-              <w:bottom w:w="110" w:type="dxa"/>
-              <w:end w:w="130" w:type="dxa"/>
+              <w:top w:w="100" w:type="dxa"/>
+              <w:start w:w="120" w:type="dxa"/>
+              <w:bottom w:w="100" w:type="dxa"/>
+              <w:end w:w="120" w:type="dxa"/>
             </w:tcMar>
           </w:tcPr>
           <w:p>
             <w:r>
-              <w:rPr>
-                <w:rFonts w:ascii="Arial" w:hAnsi="Arial"/>
-                <w:color w:val="0B172A"/>
-                <w:sz w:val="18"/>
-              </w:rPr>
-              <w:t>Apple App Review</w:t>
-            </w:r>
-          </w:p>
-        </w:tc>
-      </w:tr>
-      <w:tr>
-        <w:trPr>
-          <w:cantSplit/>
-        </w:trPr>
-        <w:tc>
-          <w:tcPr>
-            <w:tcW w:type="dxa" w:w="2376"/>
-            <w:vAlign w:val="center"/>
-            <w:tcMar>
-              <w:top w:w="110" w:type="dxa"/>
-              <w:start w:w="130" w:type="dxa"/>
-              <w:bottom w:w="110" w:type="dxa"/>
-              <w:end w:w="130" w:type="dxa"/>
-            </w:tcMar>
-            <w:shd w:fill="F5F7F9"/>
-          </w:tcPr>
-          <w:p>
-            <w:r>
-              <w:rPr>
-                <w:rFonts w:ascii="Arial" w:hAnsi="Arial"/>
-                <w:color w:val="0B172A"/>
-                <w:sz w:val="18"/>
-              </w:rPr>
-              <w:t>Response date</w:t>
-            </w:r>
-          </w:p>
-        </w:tc>
-        <w:tc>
-          <w:tcPr>
-            <w:tcW w:type="dxa" w:w="7560"/>
-            <w:vAlign w:val="center"/>
-            <w:tcMar>
-              <w:top w:w="110" w:type="dxa"/>
-              <w:start w:w="130" w:type="dxa"/>
-              <w:bottom w:w="110" w:type="dxa"/>
-              <w:end w:w="130" w:type="dxa"/>
-            </w:tcMar>
-            <w:shd w:fill="F5F7F9"/>
-          </w:tcPr>
-          <w:p>
-            <w:r>
-              <w:rPr>
-                <w:rFonts w:ascii="Arial" w:hAnsi="Arial"/>
-                <w:color w:val="0B172A"/>
-                <w:sz w:val="18"/>
-              </w:rPr>
-              <w:t>September 10, 2026</w:t>
-            </w:r>
-          </w:p>
-        </w:tc>
-      </w:tr>
-    </w:tbl>
-    <w:p>
-      <w:pPr>
-        <w:spacing w:after="200" w:before="40"/>
-        <w:jc w:val="left"/>
-      </w:pPr>
-      <w:r>
-        <w:rPr>
-          <w:rFonts w:ascii="Arial" w:hAnsi="Arial"/>
-          <w:b/>
-          <w:color w:val="00A98F"/>
-          <w:sz w:val="18"/>
-        </w:rPr>
-        <w:t>SUBMITTED BY SG PAX CORP.</w:t>
-      </w:r>
-    </w:p>
-    <w:p>
-      <w:pPr>
-        <w:spacing w:after="160" w:line="269" w:lineRule="auto"/>
-      </w:pPr>
-      <w:r>
-        <w:t>This document provides the requested information for review of the NeuroTrader iOS app. A physical-device screen recording is attached separately in the Resolution Center. The submitted iOS app is a companion to an existing web service and does not provide account registration, pricing, checkout, subscription purchases, upgrades, or external purchase links.</w:t>
-      </w:r>
-    </w:p>
-    <w:p>
-      <w:pPr>
-        <w:spacing w:after="200" w:line="269" w:lineRule="auto"/>
-      </w:pPr>
-      <w:r>
-        <w:rPr>
-          <w:b/>
-        </w:rPr>
-        <w:t>Reviewer action requested:</w:t>
-      </w:r>
-      <w:r>
-        <w:t xml:space="preserve"> Please use the credentials in Section 3 to access the preloaded demonstration workspace. All balances, trades, journals, analytics, and results in the review accounts are simulated solely for App Review.</w:t>
-      </w:r>
-    </w:p>
-    <w:tbl>
-      <w:tblPr>
-        <w:tblStyle w:val="TableGrid"/>
-        <w:tblW w:type="auto" w:w="0"/>
-        <w:jc w:val="center"/>
-        <w:tblLayout w:type="fixed"/>
-        <w:tblLook w:firstColumn="1" w:firstRow="1" w:lastColumn="0" w:lastRow="0" w:noHBand="0" w:noVBand="1" w:val="04A0"/>
-        <w:tblBorders>
-          <w:top w:val="single" w:sz="6" w:space="0" w:color="D9D9D9"/>
-          <w:left w:val="single" w:sz="6" w:space="0" w:color="D9D9D9"/>
-          <w:bottom w:val="single" w:sz="6" w:space="0" w:color="D9D9D9"/>
-          <w:right w:val="single" w:sz="6" w:space="0" w:color="D9D9D9"/>
-          <w:insideH w:val="single" w:sz="6" w:space="0" w:color="D9D9D9"/>
-          <w:insideV w:val="single" w:sz="6" w:space="0" w:color="D9D9D9"/>
-        </w:tblBorders>
-      </w:tblPr>
-      <w:tblGrid>
-        <w:gridCol w:w="792"/>
-        <w:gridCol w:w="6120"/>
-        <w:gridCol w:w="3024"/>
-      </w:tblGrid>
-      <w:tr>
-        <w:trPr>
-          <w:cantSplit/>
-          <w:tblHeader w:val="true"/>
-        </w:trPr>
-        <w:tc>
-          <w:tcPr>
-            <w:tcW w:type="dxa" w:w="792"/>
-            <w:vAlign w:val="center"/>
-            <w:tcMar>
-              <w:top w:w="110" w:type="dxa"/>
-              <w:start w:w="130" w:type="dxa"/>
-              <w:bottom w:w="110" w:type="dxa"/>
-              <w:end w:w="130" w:type="dxa"/>
-            </w:tcMar>
-            <w:shd w:fill="17324D"/>
-          </w:tcPr>
-          <w:p>
-            <w:pPr>
-              <w:spacing w:after="0" w:line="252" w:lineRule="auto"/>
-            </w:pPr>
-            <w:r>
-              <w:rPr>
-                <w:rFonts w:ascii="Aptos" w:hAnsi="Aptos"/>
-                <w:b/>
-                <w:color w:val="FFFFFF"/>
-                <w:sz w:val="18"/>
-              </w:rPr>
-              <w:t>Item</w:t>
-            </w:r>
-          </w:p>
-        </w:tc>
-        <w:tc>
-          <w:tcPr>
-            <w:tcW w:type="dxa" w:w="6120"/>
-            <w:vAlign w:val="center"/>
-            <w:tcMar>
-              <w:top w:w="110" w:type="dxa"/>
-              <w:start w:w="130" w:type="dxa"/>
-              <w:bottom w:w="110" w:type="dxa"/>
-              <w:end w:w="130" w:type="dxa"/>
-            </w:tcMar>
-            <w:shd w:fill="17324D"/>
-          </w:tcPr>
-          <w:p>
-            <w:pPr>
-              <w:spacing w:after="0" w:line="252" w:lineRule="auto"/>
-            </w:pPr>
-            <w:r>
-              <w:rPr>
-                <w:rFonts w:ascii="Aptos" w:hAnsi="Aptos"/>
-                <w:b/>
-                <w:color w:val="FFFFFF"/>
-                <w:sz w:val="18"/>
-              </w:rPr>
-              <w:t>Requested information</w:t>
-            </w:r>
-          </w:p>
-        </w:tc>
-        <w:tc>
-          <w:tcPr>
-            <w:tcW w:type="dxa" w:w="3024"/>
-            <w:vAlign w:val="center"/>
-            <w:tcMar>
-              <w:top w:w="110" w:type="dxa"/>
-              <w:start w:w="130" w:type="dxa"/>
-              <w:bottom w:w="110" w:type="dxa"/>
-              <w:end w:w="130" w:type="dxa"/>
-            </w:tcMar>
-            <w:shd w:fill="17324D"/>
-          </w:tcPr>
-          <w:p>
-            <w:pPr>
-              <w:spacing w:after="0" w:line="252" w:lineRule="auto"/>
-            </w:pPr>
-            <w:r>
-              <w:rPr>
-                <w:rFonts w:ascii="Aptos" w:hAnsi="Aptos"/>
-                <w:b/>
-                <w:color w:val="FFFFFF"/>
-                <w:sz w:val="18"/>
-              </w:rPr>
-              <w:t>Provided</w:t>
-            </w:r>
-          </w:p>
-        </w:tc>
-      </w:tr>
-      <w:tr>
-        <w:trPr>
-          <w:cantSplit/>
-        </w:trPr>
-        <w:tc>
-          <w:tcPr>
-            <w:tcW w:type="dxa" w:w="792"/>
-            <w:vAlign w:val="center"/>
-            <w:tcMar>
-              <w:top w:w="110" w:type="dxa"/>
-              <w:start w:w="130" w:type="dxa"/>
-              <w:bottom w:w="110" w:type="dxa"/>
-              <w:end w:w="130" w:type="dxa"/>
-            </w:tcMar>
-          </w:tcPr>
-          <w:p>
-            <w:pPr>
-              <w:spacing w:after="0" w:line="252" w:lineRule="auto"/>
-              <w:jc w:val="center"/>
-            </w:pPr>
-            <w:r>
-              <w:rPr>
-                <w:rFonts w:ascii="Aptos" w:hAnsi="Aptos"/>
-                <w:sz w:val="18"/>
-              </w:rPr>
-              <w:t>1</w:t>
-            </w:r>
-          </w:p>
-        </w:tc>
-        <w:tc>
-          <w:tcPr>
-            <w:tcW w:type="dxa" w:w="6120"/>
-            <w:vAlign w:val="center"/>
-            <w:tcMar>
-              <w:top w:w="110" w:type="dxa"/>
-              <w:start w:w="130" w:type="dxa"/>
-              <w:bottom w:w="110" w:type="dxa"/>
-              <w:end w:w="130" w:type="dxa"/>
-            </w:tcMar>
-          </w:tcPr>
-          <w:p>
-            <w:pPr>
-              <w:spacing w:after="0" w:line="252" w:lineRule="auto"/>
-            </w:pPr>
-            <w:r>
-              <w:rPr>
-                <w:rFonts w:ascii="Aptos" w:hAnsi="Aptos"/>
-                <w:sz w:val="18"/>
-              </w:rPr>
-              <w:t>Physical-device recording and relevant flows</w:t>
-            </w:r>
-          </w:p>
-        </w:tc>
-        <w:tc>
-          <w:tcPr>
-            <w:tcW w:type="dxa" w:w="3024"/>
-            <w:vAlign w:val="center"/>
-            <w:tcMar>
-              <w:top w:w="110" w:type="dxa"/>
-              <w:start w:w="130" w:type="dxa"/>
-              <w:bottom w:w="110" w:type="dxa"/>
-              <w:end w:w="130" w:type="dxa"/>
-            </w:tcMar>
-          </w:tcPr>
-          <w:p>
-            <w:pPr>
-              <w:spacing w:after="0" w:line="252" w:lineRule="auto"/>
-            </w:pPr>
-            <w:r>
-              <w:rPr>
-                <w:rFonts w:ascii="Aptos" w:hAnsi="Aptos"/>
-                <w:sz w:val="18"/>
-              </w:rPr>
-              <w:t>Recording attached separately</w:t>
-            </w:r>
-          </w:p>
-        </w:tc>
-      </w:tr>
-      <w:tr>
-        <w:trPr>
-          <w:cantSplit/>
-        </w:trPr>
-        <w:tc>
-          <w:tcPr>
-            <w:tcW w:type="dxa" w:w="792"/>
-            <w:vAlign w:val="center"/>
-            <w:tcMar>
-              <w:top w:w="110" w:type="dxa"/>
-              <w:start w:w="130" w:type="dxa"/>
-              <w:bottom w:w="110" w:type="dxa"/>
-              <w:end w:w="130" w:type="dxa"/>
-            </w:tcMar>
-            <w:shd w:fill="F5F7F9"/>
-          </w:tcPr>
-          <w:p>
-            <w:pPr>
-              <w:spacing w:after="0" w:line="252" w:lineRule="auto"/>
-              <w:jc w:val="center"/>
-            </w:pPr>
-            <w:r>
-              <w:rPr>
-                <w:rFonts w:ascii="Aptos" w:hAnsi="Aptos"/>
-                <w:sz w:val="18"/>
-              </w:rPr>
-              <w:t>2</w:t>
-            </w:r>
-          </w:p>
-        </w:tc>
-        <w:tc>
-          <w:tcPr>
-            <w:tcW w:type="dxa" w:w="6120"/>
-            <w:vAlign w:val="center"/>
-            <w:tcMar>
-              <w:top w:w="110" w:type="dxa"/>
-              <w:start w:w="130" w:type="dxa"/>
-              <w:bottom w:w="110" w:type="dxa"/>
-              <w:end w:w="130" w:type="dxa"/>
-            </w:tcMar>
-            <w:shd w:fill="F5F7F9"/>
-          </w:tcPr>
-          <w:p>
-            <w:pPr>
-              <w:spacing w:after="0" w:line="252" w:lineRule="auto"/>
-            </w:pPr>
-            <w:r>
-              <w:rPr>
-                <w:rFonts w:ascii="Aptos" w:hAnsi="Aptos"/>
-                <w:sz w:val="18"/>
-              </w:rPr>
-              <w:t>Purpose, audience, problem, and value</w:t>
-            </w:r>
-          </w:p>
-        </w:tc>
-        <w:tc>
-          <w:tcPr>
-            <w:tcW w:type="dxa" w:w="3024"/>
-            <w:vAlign w:val="center"/>
-            <w:tcMar>
-              <w:top w:w="110" w:type="dxa"/>
-              <w:start w:w="130" w:type="dxa"/>
-              <w:bottom w:w="110" w:type="dxa"/>
-              <w:end w:w="130" w:type="dxa"/>
-            </w:tcMar>
-            <w:shd w:fill="F5F7F9"/>
-          </w:tcPr>
-          <w:p>
-            <w:pPr>
-              <w:spacing w:after="0" w:line="252" w:lineRule="auto"/>
-            </w:pPr>
-            <w:r>
-              <w:rPr>
-                <w:rFonts w:ascii="Aptos" w:hAnsi="Aptos"/>
-                <w:sz w:val="18"/>
-              </w:rPr>
-              <w:t>Section 2</w:t>
-            </w:r>
-          </w:p>
-        </w:tc>
-      </w:tr>
-      <w:tr>
-        <w:trPr>
-          <w:cantSplit/>
-        </w:trPr>
-        <w:tc>
-          <w:tcPr>
-            <w:tcW w:type="dxa" w:w="792"/>
-            <w:vAlign w:val="center"/>
-            <w:tcMar>
-              <w:top w:w="110" w:type="dxa"/>
-              <w:start w:w="130" w:type="dxa"/>
-              <w:bottom w:w="110" w:type="dxa"/>
-              <w:end w:w="130" w:type="dxa"/>
-            </w:tcMar>
-          </w:tcPr>
-          <w:p>
-            <w:pPr>
-              <w:spacing w:after="0" w:line="252" w:lineRule="auto"/>
-              <w:jc w:val="center"/>
-            </w:pPr>
-            <w:r>
-              <w:rPr>
-                <w:rFonts w:ascii="Aptos" w:hAnsi="Aptos"/>
-                <w:sz w:val="18"/>
-              </w:rPr>
-              <w:t>3</w:t>
-            </w:r>
-          </w:p>
-        </w:tc>
-        <w:tc>
-          <w:tcPr>
-            <w:tcW w:type="dxa" w:w="6120"/>
-            <w:vAlign w:val="center"/>
-            <w:tcMar>
-              <w:top w:w="110" w:type="dxa"/>
-              <w:start w:w="130" w:type="dxa"/>
-              <w:bottom w:w="110" w:type="dxa"/>
-              <w:end w:w="130" w:type="dxa"/>
-            </w:tcMar>
-          </w:tcPr>
-          <w:p>
-            <w:pPr>
-              <w:spacing w:after="0" w:line="252" w:lineRule="auto"/>
-            </w:pPr>
-            <w:r>
-              <w:rPr>
-                <w:rFonts w:ascii="Aptos" w:hAnsi="Aptos"/>
-                <w:sz w:val="18"/>
-              </w:rPr>
-              <w:t>Setup, credentials, and feature access</w:t>
-            </w:r>
-          </w:p>
-        </w:tc>
-        <w:tc>
-          <w:tcPr>
-            <w:tcW w:type="dxa" w:w="3024"/>
-            <w:vAlign w:val="center"/>
-            <w:tcMar>
-              <w:top w:w="110" w:type="dxa"/>
-              <w:start w:w="130" w:type="dxa"/>
-              <w:bottom w:w="110" w:type="dxa"/>
-              <w:end w:w="130" w:type="dxa"/>
-            </w:tcMar>
-          </w:tcPr>
-          <w:p>
-            <w:pPr>
-              <w:spacing w:after="0" w:line="252" w:lineRule="auto"/>
-            </w:pPr>
-            <w:r>
-              <w:rPr>
-                <w:rFonts w:ascii="Aptos" w:hAnsi="Aptos"/>
-                <w:sz w:val="18"/>
-              </w:rPr>
-              <w:t>Section 3</w:t>
-            </w:r>
-          </w:p>
-        </w:tc>
-      </w:tr>
-      <w:tr>
-        <w:trPr>
-          <w:cantSplit/>
-        </w:trPr>
-        <w:tc>
-          <w:tcPr>
-            <w:tcW w:type="dxa" w:w="792"/>
-            <w:vAlign w:val="center"/>
-            <w:tcMar>
-              <w:top w:w="110" w:type="dxa"/>
-              <w:start w:w="130" w:type="dxa"/>
-              <w:bottom w:w="110" w:type="dxa"/>
-              <w:end w:w="130" w:type="dxa"/>
-            </w:tcMar>
-            <w:shd w:fill="F5F7F9"/>
-          </w:tcPr>
-          <w:p>
-            <w:pPr>
-              <w:spacing w:after="0" w:line="252" w:lineRule="auto"/>
-              <w:jc w:val="center"/>
-            </w:pPr>
-            <w:r>
-              <w:rPr>
-                <w:rFonts w:ascii="Aptos" w:hAnsi="Aptos"/>
-                <w:sz w:val="18"/>
-              </w:rPr>
-              <w:t>4</w:t>
-            </w:r>
-          </w:p>
-        </w:tc>
-        <w:tc>
-          <w:tcPr>
-            <w:tcW w:type="dxa" w:w="6120"/>
-            <w:vAlign w:val="center"/>
-            <w:tcMar>
-              <w:top w:w="110" w:type="dxa"/>
-              <w:start w:w="130" w:type="dxa"/>
-              <w:bottom w:w="110" w:type="dxa"/>
-              <w:end w:w="130" w:type="dxa"/>
-            </w:tcMar>
-            <w:shd w:fill="F5F7F9"/>
-          </w:tcPr>
-          <w:p>
-            <w:pPr>
-              <w:spacing w:after="0" w:line="252" w:lineRule="auto"/>
-            </w:pPr>
-            <w:r>
-              <w:rPr>
-                <w:rFonts w:ascii="Aptos" w:hAnsi="Aptos"/>
-                <w:sz w:val="18"/>
-              </w:rPr>
-              <w:t>External services and platforms</w:t>
-            </w:r>
-          </w:p>
-        </w:tc>
-        <w:tc>
-          <w:tcPr>
-            <w:tcW w:type="dxa" w:w="3024"/>
-            <w:vAlign w:val="center"/>
-            <w:tcMar>
-              <w:top w:w="110" w:type="dxa"/>
-              <w:start w:w="130" w:type="dxa"/>
-              <w:bottom w:w="110" w:type="dxa"/>
-              <w:end w:w="130" w:type="dxa"/>
-            </w:tcMar>
-            <w:shd w:fill="F5F7F9"/>
-          </w:tcPr>
-          <w:p>
-            <w:pPr>
-              <w:spacing w:after="0" w:line="252" w:lineRule="auto"/>
-            </w:pPr>
-            <w:r>
-              <w:rPr>
-                <w:rFonts w:ascii="Aptos" w:hAnsi="Aptos"/>
-                <w:sz w:val="18"/>
-              </w:rPr>
-              <w:t>Section 4</w:t>
-            </w:r>
-          </w:p>
-        </w:tc>
-      </w:tr>
-      <w:tr>
-        <w:trPr>
-          <w:cantSplit/>
-        </w:trPr>
-        <w:tc>
-          <w:tcPr>
-            <w:tcW w:type="dxa" w:w="792"/>
-            <w:vAlign w:val="center"/>
-            <w:tcMar>
-              <w:top w:w="110" w:type="dxa"/>
-              <w:start w:w="130" w:type="dxa"/>
-              <w:bottom w:w="110" w:type="dxa"/>
-              <w:end w:w="130" w:type="dxa"/>
-            </w:tcMar>
-          </w:tcPr>
-          <w:p>
-            <w:pPr>
-              <w:spacing w:after="0" w:line="252" w:lineRule="auto"/>
-              <w:jc w:val="center"/>
-            </w:pPr>
-            <w:r>
-              <w:rPr>
-                <w:rFonts w:ascii="Aptos" w:hAnsi="Aptos"/>
-                <w:sz w:val="18"/>
-              </w:rPr>
-              <w:t>5</w:t>
-            </w:r>
-          </w:p>
-        </w:tc>
-        <w:tc>
-          <w:tcPr>
-            <w:tcW w:type="dxa" w:w="6120"/>
-            <w:vAlign w:val="center"/>
-            <w:tcMar>
-              <w:top w:w="110" w:type="dxa"/>
-              <w:start w:w="130" w:type="dxa"/>
-              <w:bottom w:w="110" w:type="dxa"/>
-              <w:end w:w="130" w:type="dxa"/>
-            </w:tcMar>
-          </w:tcPr>
-          <w:p>
-            <w:pPr>
-              <w:spacing w:after="0" w:line="252" w:lineRule="auto"/>
-            </w:pPr>
-            <w:r>
-              <w:rPr>
-                <w:rFonts w:ascii="Aptos" w:hAnsi="Aptos"/>
-                <w:sz w:val="18"/>
-              </w:rPr>
-              <w:t>Regional differences</w:t>
-            </w:r>
-          </w:p>
-        </w:tc>
-        <w:tc>
-          <w:tcPr>
-            <w:tcW w:type="dxa" w:w="3024"/>
-            <w:vAlign w:val="center"/>
-            <w:tcMar>
-              <w:top w:w="110" w:type="dxa"/>
-              <w:start w:w="130" w:type="dxa"/>
-              <w:bottom w:w="110" w:type="dxa"/>
-              <w:end w:w="130" w:type="dxa"/>
-            </w:tcMar>
-          </w:tcPr>
-          <w:p>
-            <w:pPr>
-              <w:spacing w:after="0" w:line="252" w:lineRule="auto"/>
-            </w:pPr>
-            <w:r>
-              <w:rPr>
-                <w:rFonts w:ascii="Aptos" w:hAnsi="Aptos"/>
-                <w:sz w:val="18"/>
-              </w:rPr>
-              <w:t>Section 5</w:t>
-            </w:r>
-          </w:p>
-        </w:tc>
-      </w:tr>
-      <w:tr>
-        <w:trPr>
-          <w:cantSplit/>
-        </w:trPr>
-        <w:tc>
-          <w:tcPr>
-            <w:tcW w:type="dxa" w:w="792"/>
-            <w:vAlign w:val="center"/>
-            <w:tcMar>
-              <w:top w:w="110" w:type="dxa"/>
-              <w:start w:w="130" w:type="dxa"/>
-              <w:bottom w:w="110" w:type="dxa"/>
-              <w:end w:w="130" w:type="dxa"/>
-            </w:tcMar>
-            <w:shd w:fill="F5F7F9"/>
-          </w:tcPr>
-          <w:p>
-            <w:pPr>
-              <w:spacing w:after="0" w:line="252" w:lineRule="auto"/>
-              <w:jc w:val="center"/>
-            </w:pPr>
-            <w:r>
-              <w:rPr>
-                <w:rFonts w:ascii="Aptos" w:hAnsi="Aptos"/>
-                <w:sz w:val="18"/>
-              </w:rPr>
-              <w:t>6</w:t>
-            </w:r>
-          </w:p>
-        </w:tc>
-        <w:tc>
-          <w:tcPr>
-            <w:tcW w:type="dxa" w:w="6120"/>
-            <w:vAlign w:val="center"/>
-            <w:tcMar>
-              <w:top w:w="110" w:type="dxa"/>
-              <w:start w:w="130" w:type="dxa"/>
-              <w:bottom w:w="110" w:type="dxa"/>
-              <w:end w:w="130" w:type="dxa"/>
-            </w:tcMar>
-            <w:shd w:fill="F5F7F9"/>
-          </w:tcPr>
-          <w:p>
-            <w:pPr>
-              <w:spacing w:after="0" w:line="252" w:lineRule="auto"/>
-            </w:pPr>
-            <w:r>
-              <w:rPr>
-                <w:rFonts w:ascii="Aptos" w:hAnsi="Aptos"/>
-                <w:sz w:val="18"/>
-              </w:rPr>
-              <w:t>Regulated activity and protected material</w:t>
-            </w:r>
-          </w:p>
-        </w:tc>
-        <w:tc>
-          <w:tcPr>
-            <w:tcW w:type="dxa" w:w="3024"/>
-            <w:vAlign w:val="center"/>
-            <w:tcMar>
-              <w:top w:w="110" w:type="dxa"/>
-              <w:start w:w="130" w:type="dxa"/>
-              <w:bottom w:w="110" w:type="dxa"/>
-              <w:end w:w="130" w:type="dxa"/>
-            </w:tcMar>
-            <w:shd w:fill="F5F7F9"/>
-          </w:tcPr>
-          <w:p>
-            <w:pPr>
-              <w:spacing w:after="0" w:line="252" w:lineRule="auto"/>
-            </w:pPr>
-            <w:r>
-              <w:rPr>
-                <w:rFonts w:ascii="Aptos" w:hAnsi="Aptos"/>
-                <w:sz w:val="18"/>
-              </w:rPr>
-              <w:t>Section 6</w:t>
+              <w:t>No order routing, trade execution, custody, brokerage, or financial advice</w:t>
             </w:r>
           </w:p>
         </w:tc>
@@ -968,86 +211,57 @@
         <w:keepNext/>
       </w:pPr>
       <w:r>
-        <w:t>1 Physical Device Recording</w:t>
+        <w:t>1 Physical device screen recording</w:t>
       </w:r>
     </w:p>
     <w:p>
-      <w:pPr>
-        <w:spacing w:after="120" w:line="269" w:lineRule="auto"/>
-      </w:pPr>
       <w:r>
-        <w:t>A separate screen recording captured on a physical iPhone running the latest available operating system is included with the Resolution Center response. The recording begins with a cold launch from the device Home Screen and demonstrates the normal reviewer flow in the latest submitted build.</w:t>
-      </w:r>
-    </w:p>
-    <w:p>
-      <w:pPr>
-        <w:spacing w:after="120" w:line="269" w:lineRule="auto"/>
-      </w:pPr>
-      <w:r>
-        <w:rPr>
-          <w:b/>
-        </w:rPr>
-        <w:t>The recording demonstrates:</w:t>
-      </w:r>
-      <w:r/>
-    </w:p>
-    <w:p>
-      <w:pPr>
-        <w:pStyle w:val="ListBullet"/>
-        <w:spacing w:after="60" w:line="259" w:lineRule="auto"/>
-      </w:pPr>
-      <w:r>
-        <w:t>Launch and sign in with the main App Review account.</w:t>
+        <w:t>A separate uninterrupted recording captured on a physical iPhone running the latest available iOS version is attached to the Resolution Center reply. It begins from the iPhone Home Screen with a cold app launch and shows the normal review flow.</w:t>
       </w:r>
     </w:p>
     <w:p>
       <w:pPr>
         <w:pStyle w:val="ListBullet"/>
-        <w:spacing w:after="60" w:line="259" w:lineRule="auto"/>
+        <w:spacing w:after="60"/>
       </w:pPr>
       <w:r>
-        <w:t>The preloaded Business Center and the Two-Year Growth Demo workspace.</w:t>
+        <w:t>Launch Neuro Trader and show that the first screen is Sign in, with no account-creation or payment control.</w:t>
       </w:r>
     </w:p>
     <w:p>
       <w:pPr>
         <w:pStyle w:val="ListBullet"/>
-        <w:spacing w:after="60" w:line="259" w:lineRule="auto"/>
+        <w:spacing w:after="60"/>
       </w:pPr>
       <w:r>
-        <w:t>The Trading Business Plan, P&amp;L records, Business KPIs, Business Notebook, Business AI Coach, settings, legal links, and navigation controls.</w:t>
+        <w:t>Log in with the main review account and open Business Center, Trading Business Plan, Execution Journal, P&amp;L, KPIs, Business Notebook, AI Coach, Settings, legal links, and sign out.</w:t>
       </w:r>
     </w:p>
     <w:p>
       <w:pPr>
         <w:pStyle w:val="ListBullet"/>
-        <w:spacing w:after="60" w:line="259" w:lineRule="auto"/>
+        <w:spacing w:after="60"/>
       </w:pPr>
       <w:r>
-        <w:t>Access to features available to an existing Advanced member. The app contains no account creation, pricing, checkout, subscription purchase, upgrade, or external purchase-link flow.</w:t>
+        <w:t>Show paid-feature access through the preauthorized review account. No purchase is performed in the iOS app.</w:t>
       </w:r>
     </w:p>
     <w:p>
       <w:pPr>
         <w:pStyle w:val="ListBullet"/>
-        <w:spacing w:after="60" w:line="259" w:lineRule="auto"/>
+        <w:spacing w:after="60"/>
       </w:pPr>
       <w:r>
-        <w:t>Sign out and permanent account deletion using the separate disposable review account.</w:t>
+        <w:t>Log in with the disposable deletion account and complete Settings, Danger zone, Delete account, including the email, DELETE phrase, and both confirmations.</w:t>
       </w:r>
     </w:p>
     <w:p>
       <w:pPr>
-        <w:spacing w:after="120" w:line="269" w:lineRule="auto"/>
+        <w:pStyle w:val="ListBullet"/>
+        <w:spacing w:after="60"/>
       </w:pPr>
       <w:r>
-        <w:rPr>
-          <w:b/>
-        </w:rPr>
-        <w:t>User-generated content:</w:t>
-      </w:r>
-      <w:r>
-        <w:t xml:space="preserve"> The build has no public content or user interaction. All journals, notes, screenshots, and AI conversations are private to the authenticated account; reporting and user-blocking mechanisms are therefore not applicable.</w:t>
+        <w:t>The app has no public feed or public user-generated content. Journals, notebook entries, screenshots, and AI conversations are private to the authenticated account, so public reporting and blocking mechanisms do not apply.</w:t>
       </w:r>
     </w:p>
     <w:p>
@@ -1056,66 +270,17 @@
         <w:keepNext/>
       </w:pPr>
       <w:r>
-        <w:t>2 Purpose and Target Audience</w:t>
+        <w:t>2 Purpose target audience problem and value</w:t>
       </w:r>
     </w:p>
     <w:p>
-      <w:pPr>
-        <w:pStyle w:val="Heading2"/>
-        <w:keepNext/>
-      </w:pPr>
       <w:r>
-        <w:t>Purpose</w:t>
+        <w:t>NeuroTrader is a trading-business operating and educational tool for self-directed Trader Entrepreneurs. It addresses fragmented plans, spreadsheets, journal notes, risk rules, and performance reviews by connecting them in one private operating workspace. Users can define a Trading Business Plan, record executions and decisions, monitor personal risk controls, review measurable performance, organize operating knowledge, simulate future paths, and request objective AI-assisted reflection grounded in their own records.</w:t>
       </w:r>
     </w:p>
     <w:p>
-      <w:pPr>
-        <w:spacing w:after="120" w:line="269" w:lineRule="auto"/>
-      </w:pPr>
       <w:r>
-        <w:t>NeuroTrader is an educational trading-business operations, recordkeeping, simulation, analytics, and accountability tool. It helps self-directed traders organize their activity as a measurable business process. Users can define an operating plan, document executions and decisions, establish personal risk controls, review historical performance, maintain private business notes, and request educational AI-assisted reflection based on their own records.</w:t>
-      </w:r>
-    </w:p>
-    <w:p>
-      <w:pPr>
-        <w:pStyle w:val="Heading2"/>
-        <w:keepNext/>
-      </w:pPr>
-      <w:r>
-        <w:t>Target audience</w:t>
-      </w:r>
-    </w:p>
-    <w:p>
-      <w:pPr>
-        <w:spacing w:after="120" w:line="269" w:lineRule="auto"/>
-      </w:pPr>
-      <w:r>
-        <w:t>The intended audience is adults who trade independently and want a structured system for planning, documentation, risk discipline, performance review, and continuous improvement. NeuroTrader refers to this user as a Trader Entrepreneur.</w:t>
-      </w:r>
-    </w:p>
-    <w:p>
-      <w:pPr>
-        <w:pStyle w:val="Heading2"/>
-        <w:keepNext/>
-      </w:pPr>
-      <w:r>
-        <w:t>Problem and value</w:t>
-      </w:r>
-    </w:p>
-    <w:p>
-      <w:pPr>
-        <w:spacing w:after="120" w:line="269" w:lineRule="auto"/>
-      </w:pPr>
-      <w:r>
-        <w:t>Many independent traders manage plans, execution records, risk rules, journals, and performance data across disconnected tools. NeuroTrader brings those records into one private workspace so the user can compare actual behavior with a written operating plan and identify measurable areas for improvement.</w:t>
-      </w:r>
-    </w:p>
-    <w:p>
-      <w:pPr>
-        <w:spacing w:after="120" w:line="269" w:lineRule="auto"/>
-      </w:pPr>
-      <w:r>
-        <w:t>NeuroTrader does not execute trades, route orders, hold funds or securities, operate a brokerage account, provide individualized financial or investment advice, or guarantee income, profit, capital growth, improved performance, or any projected result. Analytics, simulations, projections, and AI outputs are educational planning information and may differ materially from actual results.</w:t>
+        <w:t>NeuroTrader does not execute trades, route orders, hold funds or securities, operate a brokerage, recommend the purchase, sale, or holding of a security, or guarantee income, profit, capital growth, or any projected result. Analytics, simulations, projections, and AI outputs are educational and may differ materially from actual results.</w:t>
       </w:r>
     </w:p>
     <w:p>
@@ -1124,16 +289,127 @@
         <w:keepNext/>
       </w:pPr>
       <w:r>
-        <w:t>3 Setup and Access to Main Features</w:t>
+        <w:t>3 Setup access and main feature instructions</w:t>
       </w:r>
     </w:p>
     <w:p>
       <w:pPr>
-        <w:pStyle w:val="Heading2"/>
-        <w:keepNext/>
+        <w:spacing w:after="100"/>
+        <w:ind w:left="259" w:hanging="259"/>
       </w:pPr>
       <w:r>
-        <w:t>Review credentials</w:t>
+        <w:rPr>
+          <w:b/>
+        </w:rPr>
+        <w:t xml:space="preserve">1. </w:t>
+      </w:r>
+      <w:r>
+        <w:t>Install and launch the latest submitted build. No sample-file upload is required.</w:t>
+      </w:r>
+    </w:p>
+    <w:p>
+      <w:pPr>
+        <w:spacing w:after="100"/>
+        <w:ind w:left="259" w:hanging="259"/>
+      </w:pPr>
+      <w:r>
+        <w:rPr>
+          <w:b/>
+        </w:rPr>
+        <w:t xml:space="preserve">2. </w:t>
+      </w:r>
+      <w:r>
+        <w:t>At Sign in, use the main review email appreview@neurotrader-journal.com and the password entered in App Store Connect Review Notes.</w:t>
+      </w:r>
+    </w:p>
+    <w:p>
+      <w:pPr>
+        <w:spacing w:after="100"/>
+        <w:ind w:left="259" w:hanging="259"/>
+      </w:pPr>
+      <w:r>
+        <w:rPr>
+          <w:b/>
+        </w:rPr>
+        <w:t xml:space="preserve">3. </w:t>
+      </w:r>
+      <w:r>
+        <w:t>Business Center opens with the preloaded Two-Year Growth Demo personal account.</w:t>
+      </w:r>
+    </w:p>
+    <w:p>
+      <w:pPr>
+        <w:spacing w:after="100"/>
+        <w:ind w:left="259" w:hanging="259"/>
+      </w:pPr>
+      <w:r>
+        <w:rPr>
+          <w:b/>
+        </w:rPr>
+        <w:t xml:space="preserve">4. </w:t>
+      </w:r>
+      <w:r>
+        <w:t>Open Trading Business Plan to review the simulated $10,000 starting balance, $250,000 target, two-year dates, risk limits, checkpoints, and completed-cycle continuation recommendation.</w:t>
+      </w:r>
+    </w:p>
+    <w:p>
+      <w:pPr>
+        <w:spacing w:after="100"/>
+        <w:ind w:left="259" w:hanging="259"/>
+      </w:pPr>
+      <w:r>
+        <w:rPr>
+          <w:b/>
+        </w:rPr>
+        <w:t xml:space="preserve">5. </w:t>
+      </w:r>
+      <w:r>
+        <w:t>Open P&amp;L and September 7, 2026 in Execution Journal to inspect populated stock, listed option-contract, crypto, and forex transactions.</w:t>
+      </w:r>
+    </w:p>
+    <w:p>
+      <w:pPr>
+        <w:spacing w:after="100"/>
+        <w:ind w:left="259" w:hanging="259"/>
+      </w:pPr>
+      <w:r>
+        <w:rPr>
+          <w:b/>
+        </w:rPr>
+        <w:t xml:space="preserve">6. </w:t>
+      </w:r>
+      <w:r>
+        <w:t>Open KPIs, Business Notebook, and Coach. A suggested coach question is Analyze my two-year plan objectively.</w:t>
+      </w:r>
+    </w:p>
+    <w:p>
+      <w:pPr>
+        <w:spacing w:after="100"/>
+        <w:ind w:left="259" w:hanging="259"/>
+      </w:pPr>
+      <w:r>
+        <w:rPr>
+          <w:b/>
+        </w:rPr>
+        <w:t xml:space="preserve">7. </w:t>
+      </w:r>
+      <w:r>
+        <w:t>Open Settings to inspect notification consent, Privacy Policy, Terms and Conditions, support, sign out, workspace reset, and permanent account deletion.</w:t>
+      </w:r>
+    </w:p>
+    <w:p>
+      <w:pPr>
+        <w:spacing w:after="100"/>
+        <w:ind w:left="259" w:hanging="259"/>
+      </w:pPr>
+      <w:r>
+        <w:rPr>
+          <w:b/>
+        </w:rPr>
+        <w:t xml:space="preserve">8. </w:t>
+      </w:r>
+      <w:r>
+        <w:t>For deletion testing, sign out and use appreview-delete@neurotrader-journal.com with the same review password. Complete the Delete account flow in Settings.</w:t>
       </w:r>
     </w:p>
     <w:tbl>
@@ -1141,756 +417,160 @@
         <w:tblStyle w:val="TableGrid"/>
         <w:tblW w:type="auto" w:w="0"/>
         <w:jc w:val="center"/>
-        <w:tblLayout w:type="fixed"/>
         <w:tblLook w:firstColumn="1" w:firstRow="1" w:lastColumn="0" w:lastRow="0" w:noHBand="0" w:noVBand="1" w:val="04A0"/>
-        <w:tblBorders>
-          <w:top w:val="single" w:sz="6" w:space="0" w:color="D9D9D9"/>
-          <w:left w:val="single" w:sz="6" w:space="0" w:color="D9D9D9"/>
-          <w:bottom w:val="single" w:sz="6" w:space="0" w:color="D9D9D9"/>
-          <w:right w:val="single" w:sz="6" w:space="0" w:color="D9D9D9"/>
-          <w:insideH w:val="single" w:sz="6" w:space="0" w:color="D9D9D9"/>
-          <w:insideV w:val="single" w:sz="6" w:space="0" w:color="D9D9D9"/>
-        </w:tblBorders>
       </w:tblPr>
       <w:tblGrid>
-        <w:gridCol w:w="2304"/>
-        <w:gridCol w:w="4608"/>
-        <w:gridCol w:w="3024"/>
+        <w:gridCol w:w="5112"/>
+        <w:gridCol w:w="5112"/>
       </w:tblGrid>
       <w:tr>
-        <w:trPr>
-          <w:cantSplit/>
-          <w:tblHeader w:val="true"/>
-        </w:trPr>
         <w:tc>
           <w:tcPr>
-            <w:tcW w:type="dxa" w:w="2304"/>
-            <w:vAlign w:val="center"/>
+            <w:tcW w:type="dxa" w:w="5112"/>
             <w:tcMar>
-              <w:top w:w="110" w:type="dxa"/>
-              <w:start w:w="130" w:type="dxa"/>
-              <w:bottom w:w="110" w:type="dxa"/>
-              <w:end w:w="130" w:type="dxa"/>
+              <w:top w:w="100" w:type="dxa"/>
+              <w:start w:w="120" w:type="dxa"/>
+              <w:bottom w:w="100" w:type="dxa"/>
+              <w:end w:w="120" w:type="dxa"/>
             </w:tcMar>
-            <w:shd w:fill="17324D"/>
+            <w:shd w:fill="ECFDF5"/>
           </w:tcPr>
           <w:p>
-            <w:pPr>
-              <w:spacing w:after="0" w:line="252" w:lineRule="auto"/>
-            </w:pPr>
             <w:r>
               <w:rPr>
-                <w:rFonts w:ascii="Aptos" w:hAnsi="Aptos"/>
                 <w:b/>
-                <w:color w:val="FFFFFF"/>
-                <w:sz w:val="17"/>
               </w:rPr>
-              <w:t>Purpose</w:t>
+              <w:t>Main review email</w:t>
             </w:r>
           </w:p>
         </w:tc>
         <w:tc>
           <w:tcPr>
-            <w:tcW w:type="dxa" w:w="4608"/>
-            <w:vAlign w:val="center"/>
+            <w:tcW w:type="dxa" w:w="5112"/>
             <w:tcMar>
-              <w:top w:w="110" w:type="dxa"/>
-              <w:start w:w="130" w:type="dxa"/>
-              <w:bottom w:w="110" w:type="dxa"/>
-              <w:end w:w="130" w:type="dxa"/>
+              <w:top w:w="100" w:type="dxa"/>
+              <w:start w:w="120" w:type="dxa"/>
+              <w:bottom w:w="100" w:type="dxa"/>
+              <w:end w:w="120" w:type="dxa"/>
             </w:tcMar>
-            <w:shd w:fill="17324D"/>
           </w:tcPr>
           <w:p>
-            <w:pPr>
-              <w:spacing w:after="0" w:line="252" w:lineRule="auto"/>
-            </w:pPr>
+            <w:r>
+              <w:t>appreview@neurotrader-journal.com</w:t>
+            </w:r>
+          </w:p>
+        </w:tc>
+      </w:tr>
+      <w:tr>
+        <w:tc>
+          <w:tcPr>
+            <w:tcW w:type="dxa" w:w="5112"/>
+            <w:tcMar>
+              <w:top w:w="100" w:type="dxa"/>
+              <w:start w:w="120" w:type="dxa"/>
+              <w:bottom w:w="100" w:type="dxa"/>
+              <w:end w:w="120" w:type="dxa"/>
+            </w:tcMar>
+            <w:shd w:fill="ECFDF5"/>
+          </w:tcPr>
+          <w:p>
             <w:r>
               <w:rPr>
-                <w:rFonts w:ascii="Aptos" w:hAnsi="Aptos"/>
                 <w:b/>
-                <w:color w:val="FFFFFF"/>
-                <w:sz w:val="17"/>
               </w:rPr>
-              <w:t>Email</w:t>
+              <w:t>Deletion test email</w:t>
             </w:r>
           </w:p>
         </w:tc>
         <w:tc>
           <w:tcPr>
-            <w:tcW w:type="dxa" w:w="3024"/>
-            <w:vAlign w:val="center"/>
+            <w:tcW w:type="dxa" w:w="5112"/>
             <w:tcMar>
-              <w:top w:w="110" w:type="dxa"/>
-              <w:start w:w="130" w:type="dxa"/>
-              <w:bottom w:w="110" w:type="dxa"/>
-              <w:end w:w="130" w:type="dxa"/>
+              <w:top w:w="100" w:type="dxa"/>
+              <w:start w:w="120" w:type="dxa"/>
+              <w:bottom w:w="100" w:type="dxa"/>
+              <w:end w:w="120" w:type="dxa"/>
             </w:tcMar>
-            <w:shd w:fill="17324D"/>
           </w:tcPr>
           <w:p>
-            <w:pPr>
-              <w:spacing w:after="0" w:line="252" w:lineRule="auto"/>
-            </w:pPr>
+            <w:r>
+              <w:t>appreview-delete@neurotrader-journal.com</w:t>
+            </w:r>
+          </w:p>
+        </w:tc>
+      </w:tr>
+      <w:tr>
+        <w:tc>
+          <w:tcPr>
+            <w:tcW w:type="dxa" w:w="5112"/>
+            <w:tcMar>
+              <w:top w:w="100" w:type="dxa"/>
+              <w:start w:w="120" w:type="dxa"/>
+              <w:bottom w:w="100" w:type="dxa"/>
+              <w:end w:w="120" w:type="dxa"/>
+            </w:tcMar>
+            <w:shd w:fill="ECFDF5"/>
+          </w:tcPr>
+          <w:p>
             <w:r>
               <w:rPr>
-                <w:rFonts w:ascii="Aptos" w:hAnsi="Aptos"/>
                 <w:b/>
-                <w:color w:val="FFFFFF"/>
-                <w:sz w:val="17"/>
               </w:rPr>
               <w:t>Password</w:t>
             </w:r>
           </w:p>
         </w:tc>
-      </w:tr>
-      <w:tr>
-        <w:trPr>
-          <w:cantSplit/>
-        </w:trPr>
         <w:tc>
           <w:tcPr>
-            <w:tcW w:type="dxa" w:w="2304"/>
-            <w:vAlign w:val="center"/>
+            <w:tcW w:type="dxa" w:w="5112"/>
             <w:tcMar>
-              <w:top w:w="110" w:type="dxa"/>
-              <w:start w:w="130" w:type="dxa"/>
-              <w:bottom w:w="110" w:type="dxa"/>
-              <w:end w:w="130" w:type="dxa"/>
+              <w:top w:w="100" w:type="dxa"/>
+              <w:start w:w="120" w:type="dxa"/>
+              <w:bottom w:w="100" w:type="dxa"/>
+              <w:end w:w="120" w:type="dxa"/>
             </w:tcMar>
           </w:tcPr>
           <w:p>
-            <w:pPr>
-              <w:spacing w:after="0" w:line="252" w:lineRule="auto"/>
-            </w:pPr>
+            <w:r>
+              <w:t>Enter the Keychain-stored review password in App Store Connect only</w:t>
+            </w:r>
+          </w:p>
+        </w:tc>
+      </w:tr>
+      <w:tr>
+        <w:tc>
+          <w:tcPr>
+            <w:tcW w:type="dxa" w:w="5112"/>
+            <w:tcMar>
+              <w:top w:w="100" w:type="dxa"/>
+              <w:start w:w="120" w:type="dxa"/>
+              <w:bottom w:w="100" w:type="dxa"/>
+              <w:end w:w="120" w:type="dxa"/>
+            </w:tcMar>
+            <w:shd w:fill="ECFDF5"/>
+          </w:tcPr>
+          <w:p>
             <w:r>
               <w:rPr>
-                <w:rFonts w:ascii="Aptos" w:hAnsi="Aptos"/>
-                <w:sz w:val="17"/>
+                <w:b/>
               </w:rPr>
-              <w:t>Main preloaded workspace</w:t>
+              <w:t>Sample files</w:t>
             </w:r>
           </w:p>
         </w:tc>
         <w:tc>
           <w:tcPr>
-            <w:tcW w:type="dxa" w:w="4608"/>
-            <w:vAlign w:val="center"/>
+            <w:tcW w:type="dxa" w:w="5112"/>
             <w:tcMar>
-              <w:top w:w="110" w:type="dxa"/>
-              <w:start w:w="130" w:type="dxa"/>
-              <w:bottom w:w="110" w:type="dxa"/>
-              <w:end w:w="130" w:type="dxa"/>
+              <w:top w:w="100" w:type="dxa"/>
+              <w:start w:w="120" w:type="dxa"/>
+              <w:bottom w:w="100" w:type="dxa"/>
+              <w:end w:w="120" w:type="dxa"/>
             </w:tcMar>
           </w:tcPr>
           <w:p>
-            <w:pPr>
-              <w:spacing w:after="0" w:line="252" w:lineRule="auto"/>
-            </w:pPr>
             <w:r>
-              <w:rPr>
-                <w:rFonts w:ascii="Aptos" w:hAnsi="Aptos"/>
-                <w:sz w:val="17"/>
-              </w:rPr>
-              <w:t>appreview@neurotrader-journal.com</w:t>
-            </w:r>
-          </w:p>
-        </w:tc>
-        <w:tc>
-          <w:tcPr>
-            <w:tcW w:type="dxa" w:w="3024"/>
-            <w:vAlign w:val="center"/>
-            <w:tcMar>
-              <w:top w:w="110" w:type="dxa"/>
-              <w:start w:w="130" w:type="dxa"/>
-              <w:bottom w:w="110" w:type="dxa"/>
-              <w:end w:w="130" w:type="dxa"/>
-            </w:tcMar>
-          </w:tcPr>
-          <w:p>
-            <w:pPr>
-              <w:spacing w:after="0" w:line="252" w:lineRule="auto"/>
-            </w:pPr>
-            <w:r>
-              <w:rPr>
-                <w:rFonts w:ascii="Aptos" w:hAnsi="Aptos"/>
-                <w:sz w:val="17"/>
-              </w:rPr>
-              <w:t>NeuroReview!2026-Plan</w:t>
-            </w:r>
-          </w:p>
-        </w:tc>
-      </w:tr>
-      <w:tr>
-        <w:trPr>
-          <w:cantSplit/>
-        </w:trPr>
-        <w:tc>
-          <w:tcPr>
-            <w:tcW w:type="dxa" w:w="2304"/>
-            <w:vAlign w:val="center"/>
-            <w:tcMar>
-              <w:top w:w="110" w:type="dxa"/>
-              <w:start w:w="130" w:type="dxa"/>
-              <w:bottom w:w="110" w:type="dxa"/>
-              <w:end w:w="130" w:type="dxa"/>
-            </w:tcMar>
-            <w:shd w:fill="F5F7F9"/>
-          </w:tcPr>
-          <w:p>
-            <w:pPr>
-              <w:spacing w:after="0" w:line="252" w:lineRule="auto"/>
-            </w:pPr>
-            <w:r>
-              <w:rPr>
-                <w:rFonts w:ascii="Aptos" w:hAnsi="Aptos"/>
-                <w:sz w:val="17"/>
-              </w:rPr>
-              <w:t>Disposable deletion test</w:t>
-            </w:r>
-          </w:p>
-        </w:tc>
-        <w:tc>
-          <w:tcPr>
-            <w:tcW w:type="dxa" w:w="4608"/>
-            <w:vAlign w:val="center"/>
-            <w:tcMar>
-              <w:top w:w="110" w:type="dxa"/>
-              <w:start w:w="130" w:type="dxa"/>
-              <w:bottom w:w="110" w:type="dxa"/>
-              <w:end w:w="130" w:type="dxa"/>
-            </w:tcMar>
-            <w:shd w:fill="F5F7F9"/>
-          </w:tcPr>
-          <w:p>
-            <w:pPr>
-              <w:spacing w:after="0" w:line="252" w:lineRule="auto"/>
-            </w:pPr>
-            <w:r>
-              <w:rPr>
-                <w:rFonts w:ascii="Aptos" w:hAnsi="Aptos"/>
-                <w:sz w:val="17"/>
-              </w:rPr>
-              <w:t>appreview-delete@neurotrader-journal.com</w:t>
-            </w:r>
-          </w:p>
-        </w:tc>
-        <w:tc>
-          <w:tcPr>
-            <w:tcW w:type="dxa" w:w="3024"/>
-            <w:vAlign w:val="center"/>
-            <w:tcMar>
-              <w:top w:w="110" w:type="dxa"/>
-              <w:start w:w="130" w:type="dxa"/>
-              <w:bottom w:w="110" w:type="dxa"/>
-              <w:end w:w="130" w:type="dxa"/>
-            </w:tcMar>
-            <w:shd w:fill="F5F7F9"/>
-          </w:tcPr>
-          <w:p>
-            <w:pPr>
-              <w:spacing w:after="0" w:line="252" w:lineRule="auto"/>
-            </w:pPr>
-            <w:r>
-              <w:rPr>
-                <w:rFonts w:ascii="Aptos" w:hAnsi="Aptos"/>
-                <w:sz w:val="17"/>
-              </w:rPr>
-              <w:t>NeuroReview!2026-Plan</w:t>
-            </w:r>
-          </w:p>
-        </w:tc>
-      </w:tr>
-    </w:tbl>
-    <w:p>
-      <w:pPr>
-        <w:spacing w:after="140" w:line="269" w:lineRule="auto" w:before="80"/>
-      </w:pPr>
-      <w:r>
-        <w:t>No sample file is required. The main account is already populated with simulated review data.</w:t>
-      </w:r>
-    </w:p>
-    <w:p>
-      <w:pPr>
-        <w:pStyle w:val="Heading2"/>
-        <w:keepNext/>
-      </w:pPr>
-      <w:r>
-        <w:t>Access instructions</w:t>
-      </w:r>
-    </w:p>
-    <w:p>
-      <w:pPr>
-        <w:pStyle w:val="ListNumber"/>
-        <w:spacing w:after="60" w:line="259" w:lineRule="auto"/>
-      </w:pPr>
-      <w:r>
-        <w:t>Launch the latest submitted build and sign in with the main credentials. The Two-Year Growth Demo opens in Business Center.</w:t>
-      </w:r>
-    </w:p>
-    <w:p>
-      <w:pPr>
-        <w:pStyle w:val="ListNumber"/>
-        <w:spacing w:after="60" w:line="259" w:lineRule="auto"/>
-      </w:pPr>
-      <w:r>
-        <w:t>Open Trading Business Plan to review the simulated $10,000-to-$250,000 two-year plan, risk controls, and completed-cycle recommendation.</w:t>
-      </w:r>
-    </w:p>
-    <w:p>
-      <w:pPr>
-        <w:pStyle w:val="ListNumber"/>
-        <w:spacing w:after="60" w:line="259" w:lineRule="auto"/>
-      </w:pPr>
-      <w:r>
-        <w:t>Use Back or Return to Business Center on deeper screens; the tab bar returns home from each primary section.</w:t>
-      </w:r>
-    </w:p>
-    <w:p>
-      <w:pPr>
-        <w:pStyle w:val="ListNumber"/>
-        <w:spacing w:after="60" w:line="259" w:lineRule="auto"/>
-      </w:pPr>
-      <w:r>
-        <w:t>Open P&amp;L for daily results and private journals, KPIs for objective performance measurements, and Business Notebook for the private operating book.</w:t>
-      </w:r>
-    </w:p>
-    <w:p>
-      <w:pPr>
-        <w:pStyle w:val="ListNumber"/>
-        <w:spacing w:after="60" w:line="259" w:lineRule="auto"/>
-      </w:pPr>
-      <w:r>
-        <w:t>Open Coach and submit: Analyze my two-year plan objectively.</w:t>
-      </w:r>
-    </w:p>
-    <w:p>
-      <w:pPr>
-        <w:pStyle w:val="ListNumber"/>
-        <w:spacing w:after="60" w:line="259" w:lineRule="auto"/>
-      </w:pPr>
-      <w:r>
-        <w:t>Open Settings to review notifications, Privacy Policy, Terms and Conditions, support, workspace reset, sign out, and permanent account deletion.</w:t>
-      </w:r>
-    </w:p>
-    <w:p>
-      <w:pPr>
-        <w:pStyle w:val="ListNumber"/>
-        <w:spacing w:after="60" w:line="259" w:lineRule="auto"/>
-      </w:pPr>
-      <w:r>
-        <w:t>To test deletion, sign out and use the disposable account. In Settings, enter its email and DELETE, then confirm both native dialogs.</w:t>
-      </w:r>
-    </w:p>
-    <w:p>
-      <w:pPr>
-        <w:pStyle w:val="Heading2"/>
-        <w:keepNext/>
-      </w:pPr>
-      <w:r>
-        <w:t>Demonstration data</w:t>
-      </w:r>
-    </w:p>
-    <w:tbl>
-      <w:tblPr>
-        <w:tblStyle w:val="TableGrid"/>
-        <w:tblW w:type="auto" w:w="0"/>
-        <w:jc w:val="center"/>
-        <w:tblLayout w:type="fixed"/>
-        <w:tblLook w:firstColumn="1" w:firstRow="1" w:lastColumn="0" w:lastRow="0" w:noHBand="0" w:noVBand="1" w:val="04A0"/>
-        <w:tblBorders>
-          <w:top w:val="single" w:sz="6" w:space="0" w:color="D9D9D9"/>
-          <w:left w:val="single" w:sz="6" w:space="0" w:color="D9D9D9"/>
-          <w:bottom w:val="single" w:sz="6" w:space="0" w:color="D9D9D9"/>
-          <w:right w:val="single" w:sz="6" w:space="0" w:color="D9D9D9"/>
-          <w:insideH w:val="single" w:sz="6" w:space="0" w:color="D9D9D9"/>
-          <w:insideV w:val="single" w:sz="6" w:space="0" w:color="D9D9D9"/>
-        </w:tblBorders>
-      </w:tblPr>
-      <w:tblGrid>
-        <w:gridCol w:w="2880"/>
-        <w:gridCol w:w="7056"/>
-      </w:tblGrid>
-      <w:tr>
-        <w:trPr>
-          <w:cantSplit/>
-          <w:tblHeader w:val="true"/>
-        </w:trPr>
-        <w:tc>
-          <w:tcPr>
-            <w:tcW w:type="dxa" w:w="2880"/>
-            <w:vAlign w:val="center"/>
-            <w:tcMar>
-              <w:top w:w="110" w:type="dxa"/>
-              <w:start w:w="130" w:type="dxa"/>
-              <w:bottom w:w="110" w:type="dxa"/>
-              <w:end w:w="130" w:type="dxa"/>
-            </w:tcMar>
-            <w:shd w:fill="17324D"/>
-          </w:tcPr>
-          <w:p>
-            <w:pPr>
-              <w:spacing w:after="0" w:line="252" w:lineRule="auto"/>
-            </w:pPr>
-            <w:r>
-              <w:rPr>
-                <w:rFonts w:ascii="Aptos" w:hAnsi="Aptos"/>
-                <w:b/>
-                <w:color w:val="FFFFFF"/>
-                <w:sz w:val="18"/>
-              </w:rPr>
-              <w:t>Field</w:t>
-            </w:r>
-          </w:p>
-        </w:tc>
-        <w:tc>
-          <w:tcPr>
-            <w:tcW w:type="dxa" w:w="7056"/>
-            <w:vAlign w:val="center"/>
-            <w:tcMar>
-              <w:top w:w="110" w:type="dxa"/>
-              <w:start w:w="130" w:type="dxa"/>
-              <w:bottom w:w="110" w:type="dxa"/>
-              <w:end w:w="130" w:type="dxa"/>
-            </w:tcMar>
-            <w:shd w:fill="17324D"/>
-          </w:tcPr>
-          <w:p>
-            <w:pPr>
-              <w:spacing w:after="0" w:line="252" w:lineRule="auto"/>
-            </w:pPr>
-            <w:r>
-              <w:rPr>
-                <w:rFonts w:ascii="Aptos" w:hAnsi="Aptos"/>
-                <w:b/>
-                <w:color w:val="FFFFFF"/>
-                <w:sz w:val="18"/>
-              </w:rPr>
-              <w:t>Simulated value</w:t>
-            </w:r>
-          </w:p>
-        </w:tc>
-      </w:tr>
-      <w:tr>
-        <w:trPr>
-          <w:cantSplit/>
-        </w:trPr>
-        <w:tc>
-          <w:tcPr>
-            <w:tcW w:type="dxa" w:w="2880"/>
-            <w:vAlign w:val="center"/>
-            <w:tcMar>
-              <w:top w:w="110" w:type="dxa"/>
-              <w:start w:w="130" w:type="dxa"/>
-              <w:bottom w:w="110" w:type="dxa"/>
-              <w:end w:w="130" w:type="dxa"/>
-            </w:tcMar>
-          </w:tcPr>
-          <w:p>
-            <w:pPr>
-              <w:spacing w:after="0" w:line="252" w:lineRule="auto"/>
-            </w:pPr>
-            <w:r>
-              <w:rPr>
-                <w:rFonts w:ascii="Aptos" w:hAnsi="Aptos"/>
-                <w:sz w:val="18"/>
-              </w:rPr>
-              <w:t>Starting balance</w:t>
-            </w:r>
-          </w:p>
-        </w:tc>
-        <w:tc>
-          <w:tcPr>
-            <w:tcW w:type="dxa" w:w="7056"/>
-            <w:vAlign w:val="center"/>
-            <w:tcMar>
-              <w:top w:w="110" w:type="dxa"/>
-              <w:start w:w="130" w:type="dxa"/>
-              <w:bottom w:w="110" w:type="dxa"/>
-              <w:end w:w="130" w:type="dxa"/>
-            </w:tcMar>
-          </w:tcPr>
-          <w:p>
-            <w:pPr>
-              <w:spacing w:after="0" w:line="252" w:lineRule="auto"/>
-            </w:pPr>
-            <w:r>
-              <w:rPr>
-                <w:rFonts w:ascii="Aptos" w:hAnsi="Aptos"/>
-                <w:sz w:val="18"/>
-              </w:rPr>
-              <w:t>$10,000.00</w:t>
-            </w:r>
-          </w:p>
-        </w:tc>
-      </w:tr>
-      <w:tr>
-        <w:trPr>
-          <w:cantSplit/>
-        </w:trPr>
-        <w:tc>
-          <w:tcPr>
-            <w:tcW w:type="dxa" w:w="2880"/>
-            <w:vAlign w:val="center"/>
-            <w:tcMar>
-              <w:top w:w="110" w:type="dxa"/>
-              <w:start w:w="130" w:type="dxa"/>
-              <w:bottom w:w="110" w:type="dxa"/>
-              <w:end w:w="130" w:type="dxa"/>
-            </w:tcMar>
-            <w:shd w:fill="F5F7F9"/>
-          </w:tcPr>
-          <w:p>
-            <w:pPr>
-              <w:spacing w:after="0" w:line="252" w:lineRule="auto"/>
-            </w:pPr>
-            <w:r>
-              <w:rPr>
-                <w:rFonts w:ascii="Aptos" w:hAnsi="Aptos"/>
-                <w:sz w:val="18"/>
-              </w:rPr>
-              <w:t>Plan period</w:t>
-            </w:r>
-          </w:p>
-        </w:tc>
-        <w:tc>
-          <w:tcPr>
-            <w:tcW w:type="dxa" w:w="7056"/>
-            <w:vAlign w:val="center"/>
-            <w:tcMar>
-              <w:top w:w="110" w:type="dxa"/>
-              <w:start w:w="130" w:type="dxa"/>
-              <w:bottom w:w="110" w:type="dxa"/>
-              <w:end w:w="130" w:type="dxa"/>
-            </w:tcMar>
-            <w:shd w:fill="F5F7F9"/>
-          </w:tcPr>
-          <w:p>
-            <w:pPr>
-              <w:spacing w:after="0" w:line="252" w:lineRule="auto"/>
-            </w:pPr>
-            <w:r>
-              <w:rPr>
-                <w:rFonts w:ascii="Aptos" w:hAnsi="Aptos"/>
-                <w:sz w:val="18"/>
-              </w:rPr>
-              <w:t>September 11, 2024 through September 10, 2026</w:t>
-            </w:r>
-          </w:p>
-        </w:tc>
-      </w:tr>
-      <w:tr>
-        <w:trPr>
-          <w:cantSplit/>
-        </w:trPr>
-        <w:tc>
-          <w:tcPr>
-            <w:tcW w:type="dxa" w:w="2880"/>
-            <w:vAlign w:val="center"/>
-            <w:tcMar>
-              <w:top w:w="110" w:type="dxa"/>
-              <w:start w:w="130" w:type="dxa"/>
-              <w:bottom w:w="110" w:type="dxa"/>
-              <w:end w:w="130" w:type="dxa"/>
-            </w:tcMar>
-          </w:tcPr>
-          <w:p>
-            <w:pPr>
-              <w:spacing w:after="0" w:line="252" w:lineRule="auto"/>
-            </w:pPr>
-            <w:r>
-              <w:rPr>
-                <w:rFonts w:ascii="Aptos" w:hAnsi="Aptos"/>
-                <w:sz w:val="18"/>
-              </w:rPr>
-              <w:t>Target balance</w:t>
-            </w:r>
-          </w:p>
-        </w:tc>
-        <w:tc>
-          <w:tcPr>
-            <w:tcW w:type="dxa" w:w="7056"/>
-            <w:vAlign w:val="center"/>
-            <w:tcMar>
-              <w:top w:w="110" w:type="dxa"/>
-              <w:start w:w="130" w:type="dxa"/>
-              <w:bottom w:w="110" w:type="dxa"/>
-              <w:end w:w="130" w:type="dxa"/>
-            </w:tcMar>
-          </w:tcPr>
-          <w:p>
-            <w:pPr>
-              <w:spacing w:after="0" w:line="252" w:lineRule="auto"/>
-            </w:pPr>
-            <w:r>
-              <w:rPr>
-                <w:rFonts w:ascii="Aptos" w:hAnsi="Aptos"/>
-                <w:sz w:val="18"/>
-              </w:rPr>
-              <w:t>$250,000.00</w:t>
-            </w:r>
-          </w:p>
-        </w:tc>
-      </w:tr>
-      <w:tr>
-        <w:trPr>
-          <w:cantSplit/>
-        </w:trPr>
-        <w:tc>
-          <w:tcPr>
-            <w:tcW w:type="dxa" w:w="2880"/>
-            <w:vAlign w:val="center"/>
-            <w:tcMar>
-              <w:top w:w="110" w:type="dxa"/>
-              <w:start w:w="130" w:type="dxa"/>
-              <w:bottom w:w="110" w:type="dxa"/>
-              <w:end w:w="130" w:type="dxa"/>
-            </w:tcMar>
-            <w:shd w:fill="F5F7F9"/>
-          </w:tcPr>
-          <w:p>
-            <w:pPr>
-              <w:spacing w:after="0" w:line="252" w:lineRule="auto"/>
-            </w:pPr>
-            <w:r>
-              <w:rPr>
-                <w:rFonts w:ascii="Aptos" w:hAnsi="Aptos"/>
-                <w:sz w:val="18"/>
-              </w:rPr>
-              <w:t>Ending balance</w:t>
-            </w:r>
-          </w:p>
-        </w:tc>
-        <w:tc>
-          <w:tcPr>
-            <w:tcW w:type="dxa" w:w="7056"/>
-            <w:vAlign w:val="center"/>
-            <w:tcMar>
-              <w:top w:w="110" w:type="dxa"/>
-              <w:start w:w="130" w:type="dxa"/>
-              <w:bottom w:w="110" w:type="dxa"/>
-              <w:end w:w="130" w:type="dxa"/>
-            </w:tcMar>
-            <w:shd w:fill="F5F7F9"/>
-          </w:tcPr>
-          <w:p>
-            <w:pPr>
-              <w:spacing w:after="0" w:line="252" w:lineRule="auto"/>
-            </w:pPr>
-            <w:r>
-              <w:rPr>
-                <w:rFonts w:ascii="Aptos" w:hAnsi="Aptos"/>
-                <w:sz w:val="18"/>
-              </w:rPr>
-              <w:t>$250,007.28</w:t>
-            </w:r>
-          </w:p>
-        </w:tc>
-      </w:tr>
-      <w:tr>
-        <w:trPr>
-          <w:cantSplit/>
-        </w:trPr>
-        <w:tc>
-          <w:tcPr>
-            <w:tcW w:type="dxa" w:w="2880"/>
-            <w:vAlign w:val="center"/>
-            <w:tcMar>
-              <w:top w:w="110" w:type="dxa"/>
-              <w:start w:w="130" w:type="dxa"/>
-              <w:bottom w:w="110" w:type="dxa"/>
-              <w:end w:w="130" w:type="dxa"/>
-            </w:tcMar>
-          </w:tcPr>
-          <w:p>
-            <w:pPr>
-              <w:spacing w:after="0" w:line="252" w:lineRule="auto"/>
-            </w:pPr>
-            <w:r>
-              <w:rPr>
-                <w:rFonts w:ascii="Aptos" w:hAnsi="Aptos"/>
-                <w:sz w:val="18"/>
-              </w:rPr>
-              <w:t>Sessions</w:t>
-            </w:r>
-          </w:p>
-        </w:tc>
-        <w:tc>
-          <w:tcPr>
-            <w:tcW w:type="dxa" w:w="7056"/>
-            <w:vAlign w:val="center"/>
-            <w:tcMar>
-              <w:top w:w="110" w:type="dxa"/>
-              <w:start w:w="130" w:type="dxa"/>
-              <w:bottom w:w="110" w:type="dxa"/>
-              <w:end w:w="130" w:type="dxa"/>
-            </w:tcMar>
-          </w:tcPr>
-          <w:p>
-            <w:pPr>
-              <w:spacing w:after="0" w:line="252" w:lineRule="auto"/>
-            </w:pPr>
-            <w:r>
-              <w:rPr>
-                <w:rFonts w:ascii="Aptos" w:hAnsi="Aptos"/>
-                <w:sz w:val="18"/>
-              </w:rPr>
-              <w:t>522 simulated weekdays</w:t>
-            </w:r>
-          </w:p>
-        </w:tc>
-      </w:tr>
-      <w:tr>
-        <w:trPr>
-          <w:cantSplit/>
-        </w:trPr>
-        <w:tc>
-          <w:tcPr>
-            <w:tcW w:type="dxa" w:w="2880"/>
-            <w:vAlign w:val="center"/>
-            <w:tcMar>
-              <w:top w:w="110" w:type="dxa"/>
-              <w:start w:w="130" w:type="dxa"/>
-              <w:bottom w:w="110" w:type="dxa"/>
-              <w:end w:w="130" w:type="dxa"/>
-            </w:tcMar>
-            <w:shd w:fill="F5F7F9"/>
-          </w:tcPr>
-          <w:p>
-            <w:pPr>
-              <w:spacing w:after="0" w:line="252" w:lineRule="auto"/>
-            </w:pPr>
-            <w:r>
-              <w:rPr>
-                <w:rFonts w:ascii="Aptos" w:hAnsi="Aptos"/>
-                <w:sz w:val="18"/>
-              </w:rPr>
-              <w:t>Risk controls</w:t>
-            </w:r>
-          </w:p>
-        </w:tc>
-        <w:tc>
-          <w:tcPr>
-            <w:tcW w:type="dxa" w:w="7056"/>
-            <w:vAlign w:val="center"/>
-            <w:tcMar>
-              <w:top w:w="110" w:type="dxa"/>
-              <w:start w:w="130" w:type="dxa"/>
-              <w:bottom w:w="110" w:type="dxa"/>
-              <w:end w:w="130" w:type="dxa"/>
-            </w:tcMar>
-            <w:shd w:fill="F5F7F9"/>
-          </w:tcPr>
-          <w:p>
-            <w:pPr>
-              <w:spacing w:after="0" w:line="252" w:lineRule="auto"/>
-            </w:pPr>
-            <w:r>
-              <w:rPr>
-                <w:rFonts w:ascii="Aptos" w:hAnsi="Aptos"/>
-                <w:sz w:val="18"/>
-              </w:rPr>
-              <w:t>0.50% per trade and 1.00% daily loss ceilings</w:t>
+              <w:t>Not required; synthetic review data is preloaded</w:t>
             </w:r>
           </w:p>
         </w:tc>
@@ -1902,623 +582,70 @@
         <w:keepNext/>
       </w:pPr>
       <w:r>
-        <w:t>4 External Services Tools and Platforms</w:t>
+        <w:t>4 External services tools and platforms</w:t>
       </w:r>
     </w:p>
     <w:p>
       <w:pPr>
-        <w:spacing w:after="120" w:line="269" w:lineRule="auto"/>
+        <w:pStyle w:val="ListBullet"/>
+        <w:spacing w:after="60"/>
       </w:pPr>
       <w:r>
-        <w:t>The following services support the submitted iOS app. Access is authenticated and the app sends only the information needed for the user-requested feature or operational purpose.</w:t>
-      </w:r>
-    </w:p>
-    <w:tbl>
-      <w:tblPr>
-        <w:tblStyle w:val="TableGrid"/>
-        <w:tblW w:type="auto" w:w="0"/>
-        <w:jc w:val="center"/>
-        <w:tblLayout w:type="fixed"/>
-        <w:tblLook w:firstColumn="1" w:firstRow="1" w:lastColumn="0" w:lastRow="0" w:noHBand="0" w:noVBand="1" w:val="04A0"/>
-        <w:tblBorders>
-          <w:top w:val="single" w:sz="6" w:space="0" w:color="D9D9D9"/>
-          <w:left w:val="single" w:sz="6" w:space="0" w:color="D9D9D9"/>
-          <w:bottom w:val="single" w:sz="6" w:space="0" w:color="D9D9D9"/>
-          <w:right w:val="single" w:sz="6" w:space="0" w:color="D9D9D9"/>
-          <w:insideH w:val="single" w:sz="6" w:space="0" w:color="D9D9D9"/>
-          <w:insideV w:val="single" w:sz="6" w:space="0" w:color="D9D9D9"/>
-        </w:tblBorders>
-      </w:tblPr>
-      <w:tblGrid>
-        <w:gridCol w:w="1843"/>
-        <w:gridCol w:w="3427"/>
-        <w:gridCol w:w="4666"/>
-      </w:tblGrid>
-      <w:tr>
-        <w:trPr>
-          <w:cantSplit/>
-          <w:tblHeader w:val="true"/>
-        </w:trPr>
-        <w:tc>
-          <w:tcPr>
-            <w:tcW w:type="dxa" w:w="1843"/>
-            <w:vAlign w:val="center"/>
-            <w:tcMar>
-              <w:top w:w="110" w:type="dxa"/>
-              <w:start w:w="130" w:type="dxa"/>
-              <w:bottom w:w="110" w:type="dxa"/>
-              <w:end w:w="130" w:type="dxa"/>
-            </w:tcMar>
-            <w:shd w:fill="17324D"/>
-          </w:tcPr>
-          <w:p>
-            <w:pPr>
-              <w:spacing w:after="0" w:line="252" w:lineRule="auto"/>
-            </w:pPr>
-            <w:r>
-              <w:rPr>
-                <w:rFonts w:ascii="Aptos" w:hAnsi="Aptos"/>
-                <w:b/>
-                <w:color w:val="FFFFFF"/>
-                <w:sz w:val="17"/>
-              </w:rPr>
-              <w:t>Service</w:t>
-            </w:r>
-          </w:p>
-        </w:tc>
-        <w:tc>
-          <w:tcPr>
-            <w:tcW w:type="dxa" w:w="3427"/>
-            <w:vAlign w:val="center"/>
-            <w:tcMar>
-              <w:top w:w="110" w:type="dxa"/>
-              <w:start w:w="130" w:type="dxa"/>
-              <w:bottom w:w="110" w:type="dxa"/>
-              <w:end w:w="130" w:type="dxa"/>
-            </w:tcMar>
-            <w:shd w:fill="17324D"/>
-          </w:tcPr>
-          <w:p>
-            <w:pPr>
-              <w:spacing w:after="0" w:line="252" w:lineRule="auto"/>
-            </w:pPr>
-            <w:r>
-              <w:rPr>
-                <w:rFonts w:ascii="Aptos" w:hAnsi="Aptos"/>
-                <w:b/>
-                <w:color w:val="FFFFFF"/>
-                <w:sz w:val="17"/>
-              </w:rPr>
-              <w:t>Purpose</w:t>
-            </w:r>
-          </w:p>
-        </w:tc>
-        <w:tc>
-          <w:tcPr>
-            <w:tcW w:type="dxa" w:w="4666"/>
-            <w:vAlign w:val="center"/>
-            <w:tcMar>
-              <w:top w:w="110" w:type="dxa"/>
-              <w:start w:w="130" w:type="dxa"/>
-              <w:bottom w:w="110" w:type="dxa"/>
-              <w:end w:w="130" w:type="dxa"/>
-            </w:tcMar>
-            <w:shd w:fill="17324D"/>
-          </w:tcPr>
-          <w:p>
-            <w:pPr>
-              <w:spacing w:after="0" w:line="252" w:lineRule="auto"/>
-            </w:pPr>
-            <w:r>
-              <w:rPr>
-                <w:rFonts w:ascii="Aptos" w:hAnsi="Aptos"/>
-                <w:b/>
-                <w:color w:val="FFFFFF"/>
-                <w:sz w:val="17"/>
-              </w:rPr>
-              <w:t>Relevant information</w:t>
-            </w:r>
-          </w:p>
-        </w:tc>
-      </w:tr>
-      <w:tr>
-        <w:trPr>
-          <w:cantSplit/>
-        </w:trPr>
-        <w:tc>
-          <w:tcPr>
-            <w:tcW w:type="dxa" w:w="1843"/>
-            <w:vAlign w:val="center"/>
-            <w:tcMar>
-              <w:top w:w="110" w:type="dxa"/>
-              <w:start w:w="130" w:type="dxa"/>
-              <w:bottom w:w="110" w:type="dxa"/>
-              <w:end w:w="130" w:type="dxa"/>
-            </w:tcMar>
-          </w:tcPr>
-          <w:p>
-            <w:pPr>
-              <w:spacing w:after="0" w:line="252" w:lineRule="auto"/>
-            </w:pPr>
-            <w:r>
-              <w:rPr>
-                <w:rFonts w:ascii="Aptos" w:hAnsi="Aptos"/>
-                <w:sz w:val="17"/>
-              </w:rPr>
-              <w:t>Supabase</w:t>
-            </w:r>
-          </w:p>
-        </w:tc>
-        <w:tc>
-          <w:tcPr>
-            <w:tcW w:type="dxa" w:w="3427"/>
-            <w:vAlign w:val="center"/>
-            <w:tcMar>
-              <w:top w:w="110" w:type="dxa"/>
-              <w:start w:w="130" w:type="dxa"/>
-              <w:bottom w:w="110" w:type="dxa"/>
-              <w:end w:w="130" w:type="dxa"/>
-            </w:tcMar>
-          </w:tcPr>
-          <w:p>
-            <w:pPr>
-              <w:spacing w:after="0" w:line="252" w:lineRule="auto"/>
-            </w:pPr>
-            <w:r>
-              <w:rPr>
-                <w:rFonts w:ascii="Aptos" w:hAnsi="Aptos"/>
-                <w:sz w:val="17"/>
-              </w:rPr>
-              <w:t>Authentication, account access, database, and private file storage</w:t>
-            </w:r>
-          </w:p>
-        </w:tc>
-        <w:tc>
-          <w:tcPr>
-            <w:tcW w:type="dxa" w:w="4666"/>
-            <w:vAlign w:val="center"/>
-            <w:tcMar>
-              <w:top w:w="110" w:type="dxa"/>
-              <w:start w:w="130" w:type="dxa"/>
-              <w:bottom w:w="110" w:type="dxa"/>
-              <w:end w:w="130" w:type="dxa"/>
-            </w:tcMar>
-          </w:tcPr>
-          <w:p>
-            <w:pPr>
-              <w:spacing w:after="0" w:line="252" w:lineRule="auto"/>
-            </w:pPr>
-            <w:r>
-              <w:rPr>
-                <w:rFonts w:ascii="Aptos" w:hAnsi="Aptos"/>
-                <w:sz w:val="17"/>
-              </w:rPr>
-              <w:t>Account profile, access status, private workspace records, and stored attachments</w:t>
-            </w:r>
-          </w:p>
-        </w:tc>
-      </w:tr>
-      <w:tr>
-        <w:trPr>
-          <w:cantSplit/>
-        </w:trPr>
-        <w:tc>
-          <w:tcPr>
-            <w:tcW w:type="dxa" w:w="1843"/>
-            <w:vAlign w:val="center"/>
-            <w:tcMar>
-              <w:top w:w="110" w:type="dxa"/>
-              <w:start w:w="130" w:type="dxa"/>
-              <w:bottom w:w="110" w:type="dxa"/>
-              <w:end w:w="130" w:type="dxa"/>
-            </w:tcMar>
-            <w:shd w:fill="F5F7F9"/>
-          </w:tcPr>
-          <w:p>
-            <w:pPr>
-              <w:spacing w:after="0" w:line="252" w:lineRule="auto"/>
-            </w:pPr>
-            <w:r>
-              <w:rPr>
-                <w:rFonts w:ascii="Aptos" w:hAnsi="Aptos"/>
-                <w:sz w:val="17"/>
-              </w:rPr>
-              <w:t>Vercel</w:t>
-            </w:r>
-          </w:p>
-        </w:tc>
-        <w:tc>
-          <w:tcPr>
-            <w:tcW w:type="dxa" w:w="3427"/>
-            <w:vAlign w:val="center"/>
-            <w:tcMar>
-              <w:top w:w="110" w:type="dxa"/>
-              <w:start w:w="130" w:type="dxa"/>
-              <w:bottom w:w="110" w:type="dxa"/>
-              <w:end w:w="130" w:type="dxa"/>
-            </w:tcMar>
-            <w:shd w:fill="F5F7F9"/>
-          </w:tcPr>
-          <w:p>
-            <w:pPr>
-              <w:spacing w:after="0" w:line="252" w:lineRule="auto"/>
-            </w:pPr>
-            <w:r>
-              <w:rPr>
-                <w:rFonts w:ascii="Aptos" w:hAnsi="Aptos"/>
-                <w:sz w:val="17"/>
-              </w:rPr>
-              <w:t>Hosting and authenticated application APIs</w:t>
-            </w:r>
-          </w:p>
-        </w:tc>
-        <w:tc>
-          <w:tcPr>
-            <w:tcW w:type="dxa" w:w="4666"/>
-            <w:vAlign w:val="center"/>
-            <w:tcMar>
-              <w:top w:w="110" w:type="dxa"/>
-              <w:start w:w="130" w:type="dxa"/>
-              <w:bottom w:w="110" w:type="dxa"/>
-              <w:end w:w="130" w:type="dxa"/>
-            </w:tcMar>
-            <w:shd w:fill="F5F7F9"/>
-          </w:tcPr>
-          <w:p>
-            <w:pPr>
-              <w:spacing w:after="0" w:line="252" w:lineRule="auto"/>
-            </w:pPr>
-            <w:r>
-              <w:rPr>
-                <w:rFonts w:ascii="Aptos" w:hAnsi="Aptos"/>
-                <w:sz w:val="17"/>
-              </w:rPr>
-              <w:t>Requests, responses, and limited operational logs needed to provide the service</w:t>
-            </w:r>
-          </w:p>
-        </w:tc>
-      </w:tr>
-      <w:tr>
-        <w:trPr>
-          <w:cantSplit/>
-        </w:trPr>
-        <w:tc>
-          <w:tcPr>
-            <w:tcW w:type="dxa" w:w="1843"/>
-            <w:vAlign w:val="center"/>
-            <w:tcMar>
-              <w:top w:w="110" w:type="dxa"/>
-              <w:start w:w="130" w:type="dxa"/>
-              <w:bottom w:w="110" w:type="dxa"/>
-              <w:end w:w="130" w:type="dxa"/>
-            </w:tcMar>
-          </w:tcPr>
-          <w:p>
-            <w:pPr>
-              <w:spacing w:after="0" w:line="252" w:lineRule="auto"/>
-            </w:pPr>
-            <w:r>
-              <w:rPr>
-                <w:rFonts w:ascii="Aptos" w:hAnsi="Aptos"/>
-                <w:sz w:val="17"/>
-              </w:rPr>
-              <w:t>OpenAI API</w:t>
-            </w:r>
-          </w:p>
-        </w:tc>
-        <w:tc>
-          <w:tcPr>
-            <w:tcW w:type="dxa" w:w="3427"/>
-            <w:vAlign w:val="center"/>
-            <w:tcMar>
-              <w:top w:w="110" w:type="dxa"/>
-              <w:start w:w="130" w:type="dxa"/>
-              <w:bottom w:w="110" w:type="dxa"/>
-              <w:end w:w="130" w:type="dxa"/>
-            </w:tcMar>
-          </w:tcPr>
-          <w:p>
-            <w:pPr>
-              <w:spacing w:after="0" w:line="252" w:lineRule="auto"/>
-            </w:pPr>
-            <w:r>
-              <w:rPr>
-                <w:rFonts w:ascii="Aptos" w:hAnsi="Aptos"/>
-                <w:sz w:val="17"/>
-              </w:rPr>
-              <w:t>Educational AI Coach responses</w:t>
-            </w:r>
-          </w:p>
-        </w:tc>
-        <w:tc>
-          <w:tcPr>
-            <w:tcW w:type="dxa" w:w="4666"/>
-            <w:vAlign w:val="center"/>
-            <w:tcMar>
-              <w:top w:w="110" w:type="dxa"/>
-              <w:start w:w="130" w:type="dxa"/>
-              <w:bottom w:w="110" w:type="dxa"/>
-              <w:end w:w="130" w:type="dxa"/>
-            </w:tcMar>
-          </w:tcPr>
-          <w:p>
-            <w:pPr>
-              <w:spacing w:after="0" w:line="252" w:lineRule="auto"/>
-            </w:pPr>
-            <w:r>
-              <w:rPr>
-                <w:rFonts w:ascii="Aptos" w:hAnsi="Aptos"/>
-                <w:sz w:val="17"/>
-              </w:rPr>
-              <w:t>Only the selected plans, journal records, trades, analytics, notes, screenshots, and conversation context needed for the user's request</w:t>
-            </w:r>
-          </w:p>
-        </w:tc>
-      </w:tr>
-      <w:tr>
-        <w:trPr>
-          <w:cantSplit/>
-        </w:trPr>
-        <w:tc>
-          <w:tcPr>
-            <w:tcW w:type="dxa" w:w="1843"/>
-            <w:vAlign w:val="center"/>
-            <w:tcMar>
-              <w:top w:w="110" w:type="dxa"/>
-              <w:start w:w="130" w:type="dxa"/>
-              <w:bottom w:w="110" w:type="dxa"/>
-              <w:end w:w="130" w:type="dxa"/>
-            </w:tcMar>
-            <w:shd w:fill="F5F7F9"/>
-          </w:tcPr>
-          <w:p>
-            <w:pPr>
-              <w:spacing w:after="0" w:line="252" w:lineRule="auto"/>
-            </w:pPr>
-            <w:r>
-              <w:rPr>
-                <w:rFonts w:ascii="Aptos" w:hAnsi="Aptos"/>
-                <w:sz w:val="17"/>
-              </w:rPr>
-              <w:t>Expo and Apple Push Notification service</w:t>
-            </w:r>
-          </w:p>
-        </w:tc>
-        <w:tc>
-          <w:tcPr>
-            <w:tcW w:type="dxa" w:w="3427"/>
-            <w:vAlign w:val="center"/>
-            <w:tcMar>
-              <w:top w:w="110" w:type="dxa"/>
-              <w:start w:w="130" w:type="dxa"/>
-              <w:bottom w:w="110" w:type="dxa"/>
-              <w:end w:w="130" w:type="dxa"/>
-            </w:tcMar>
-            <w:shd w:fill="F5F7F9"/>
-          </w:tcPr>
-          <w:p>
-            <w:pPr>
-              <w:spacing w:after="0" w:line="252" w:lineRule="auto"/>
-            </w:pPr>
-            <w:r>
-              <w:rPr>
-                <w:rFonts w:ascii="Aptos" w:hAnsi="Aptos"/>
-                <w:sz w:val="17"/>
-              </w:rPr>
-              <w:t>Mobile build services, device registration, and optional reminders</w:t>
-            </w:r>
-          </w:p>
-        </w:tc>
-        <w:tc>
-          <w:tcPr>
-            <w:tcW w:type="dxa" w:w="4666"/>
-            <w:vAlign w:val="center"/>
-            <w:tcMar>
-              <w:top w:w="110" w:type="dxa"/>
-              <w:start w:w="130" w:type="dxa"/>
-              <w:bottom w:w="110" w:type="dxa"/>
-              <w:end w:w="130" w:type="dxa"/>
-            </w:tcMar>
-            <w:shd w:fill="F5F7F9"/>
-          </w:tcPr>
-          <w:p>
-            <w:pPr>
-              <w:spacing w:after="0" w:line="252" w:lineRule="auto"/>
-            </w:pPr>
-            <w:r>
-              <w:rPr>
-                <w:rFonts w:ascii="Aptos" w:hAnsi="Aptos"/>
-                <w:sz w:val="17"/>
-              </w:rPr>
-              <w:t>App/device identifiers, locale, push token, and notification preferences</w:t>
-            </w:r>
-          </w:p>
-        </w:tc>
-      </w:tr>
-      <w:tr>
-        <w:trPr>
-          <w:cantSplit/>
-        </w:trPr>
-        <w:tc>
-          <w:tcPr>
-            <w:tcW w:type="dxa" w:w="1843"/>
-            <w:vAlign w:val="center"/>
-            <w:tcMar>
-              <w:top w:w="110" w:type="dxa"/>
-              <w:start w:w="130" w:type="dxa"/>
-              <w:bottom w:w="110" w:type="dxa"/>
-              <w:end w:w="130" w:type="dxa"/>
-            </w:tcMar>
-          </w:tcPr>
-          <w:p>
-            <w:pPr>
-              <w:spacing w:after="0" w:line="252" w:lineRule="auto"/>
-            </w:pPr>
-            <w:r>
-              <w:rPr>
-                <w:rFonts w:ascii="Aptos" w:hAnsi="Aptos"/>
-                <w:sz w:val="17"/>
-              </w:rPr>
-              <w:t>Resend</w:t>
-            </w:r>
-          </w:p>
-        </w:tc>
-        <w:tc>
-          <w:tcPr>
-            <w:tcW w:type="dxa" w:w="3427"/>
-            <w:vAlign w:val="center"/>
-            <w:tcMar>
-              <w:top w:w="110" w:type="dxa"/>
-              <w:start w:w="130" w:type="dxa"/>
-              <w:bottom w:w="110" w:type="dxa"/>
-              <w:end w:w="130" w:type="dxa"/>
-            </w:tcMar>
-          </w:tcPr>
-          <w:p>
-            <w:pPr>
-              <w:spacing w:after="0" w:line="252" w:lineRule="auto"/>
-            </w:pPr>
-            <w:r>
-              <w:rPr>
-                <w:rFonts w:ascii="Aptos" w:hAnsi="Aptos"/>
-                <w:sz w:val="17"/>
-              </w:rPr>
-              <w:t>Account, security, support, and service email</w:t>
-            </w:r>
-          </w:p>
-        </w:tc>
-        <w:tc>
-          <w:tcPr>
-            <w:tcW w:type="dxa" w:w="4666"/>
-            <w:vAlign w:val="center"/>
-            <w:tcMar>
-              <w:top w:w="110" w:type="dxa"/>
-              <w:start w:w="130" w:type="dxa"/>
-              <w:bottom w:w="110" w:type="dxa"/>
-              <w:end w:w="130" w:type="dxa"/>
-            </w:tcMar>
-          </w:tcPr>
-          <w:p>
-            <w:pPr>
-              <w:spacing w:after="0" w:line="252" w:lineRule="auto"/>
-            </w:pPr>
-            <w:r>
-              <w:rPr>
-                <w:rFonts w:ascii="Aptos" w:hAnsi="Aptos"/>
-                <w:sz w:val="17"/>
-              </w:rPr>
-              <w:t>Email address and the content necessary for the service message</w:t>
-            </w:r>
-          </w:p>
-        </w:tc>
-      </w:tr>
-      <w:tr>
-        <w:trPr>
-          <w:cantSplit/>
-        </w:trPr>
-        <w:tc>
-          <w:tcPr>
-            <w:tcW w:type="dxa" w:w="1843"/>
-            <w:vAlign w:val="center"/>
-            <w:tcMar>
-              <w:top w:w="110" w:type="dxa"/>
-              <w:start w:w="130" w:type="dxa"/>
-              <w:bottom w:w="110" w:type="dxa"/>
-              <w:end w:w="130" w:type="dxa"/>
-            </w:tcMar>
-            <w:shd w:fill="F5F7F9"/>
-          </w:tcPr>
-          <w:p>
-            <w:pPr>
-              <w:spacing w:after="0" w:line="252" w:lineRule="auto"/>
-            </w:pPr>
-            <w:r>
-              <w:rPr>
-                <w:rFonts w:ascii="Aptos" w:hAnsi="Aptos"/>
-                <w:sz w:val="17"/>
-              </w:rPr>
-              <w:t>Stripe</w:t>
-            </w:r>
-          </w:p>
-        </w:tc>
-        <w:tc>
-          <w:tcPr>
-            <w:tcW w:type="dxa" w:w="3427"/>
-            <w:vAlign w:val="center"/>
-            <w:tcMar>
-              <w:top w:w="110" w:type="dxa"/>
-              <w:start w:w="130" w:type="dxa"/>
-              <w:bottom w:w="110" w:type="dxa"/>
-              <w:end w:w="130" w:type="dxa"/>
-            </w:tcMar>
-            <w:shd w:fill="F5F7F9"/>
-          </w:tcPr>
-          <w:p>
-            <w:pPr>
-              <w:spacing w:after="0" w:line="252" w:lineRule="auto"/>
-            </w:pPr>
-            <w:r>
-              <w:rPr>
-                <w:rFonts w:ascii="Aptos" w:hAnsi="Aptos"/>
-                <w:sz w:val="17"/>
-              </w:rPr>
-              <w:t>Memberships initiated and managed outside the submitted iOS app</w:t>
-            </w:r>
-          </w:p>
-        </w:tc>
-        <w:tc>
-          <w:tcPr>
-            <w:tcW w:type="dxa" w:w="4666"/>
-            <w:vAlign w:val="center"/>
-            <w:tcMar>
-              <w:top w:w="110" w:type="dxa"/>
-              <w:start w:w="130" w:type="dxa"/>
-              <w:bottom w:w="110" w:type="dxa"/>
-              <w:end w:w="130" w:type="dxa"/>
-            </w:tcMar>
-            <w:shd w:fill="F5F7F9"/>
-          </w:tcPr>
-          <w:p>
-            <w:pPr>
-              <w:spacing w:after="0" w:line="252" w:lineRule="auto"/>
-            </w:pPr>
-            <w:r>
-              <w:rPr>
-                <w:rFonts w:ascii="Aptos" w:hAnsi="Aptos"/>
-                <w:sz w:val="17"/>
-              </w:rPr>
-              <w:t>External billing and membership status; no payment details or purchase flow is presented in iOS</w:t>
-            </w:r>
-          </w:p>
-        </w:tc>
-      </w:tr>
-    </w:tbl>
-    <w:p>
-      <w:pPr>
-        <w:spacing w:after="120" w:line="269" w:lineRule="auto"/>
-      </w:pPr>
-      <w:r>
-        <w:rPr>
-          <w:b/>
-        </w:rPr>
-        <w:t>AI processing consent:</w:t>
-      </w:r>
-      <w:r>
-        <w:t xml:space="preserve"> If the Terms or Privacy Policy version changes, private workspace access is blocked until the authenticated user reviews and affirmatively accepts the current documents. The mobile disclosure expressly identifies the categories of selected records that may be sent to OpenAI or another disclosed AI provider when the user chooses an AI feature.</w:t>
+        <w:t>Supabase provides authentication, access status, the private application database, row-level access control, and private file storage.</w:t>
       </w:r>
     </w:p>
     <w:p>
       <w:pPr>
-        <w:spacing w:after="120" w:line="269" w:lineRule="auto"/>
+        <w:pStyle w:val="ListBullet"/>
+        <w:spacing w:after="60"/>
       </w:pPr>
       <w:r>
-        <w:rPr>
-          <w:b/>
-        </w:rPr>
-        <w:t>Broker connectivity:</w:t>
+        <w:t>Vercel hosts the authenticated application API used by the mobile client and scheduled operational jobs.</w:t>
       </w:r>
+    </w:p>
+    <w:p>
+      <w:pPr>
+        <w:pStyle w:val="ListBullet"/>
+        <w:spacing w:after="60"/>
+      </w:pPr>
       <w:r>
-        <w:t xml:space="preserve"> Direct broker connections are disabled in the submitted iOS build while provider approvals and production readiness are completed. The submitted build does not place trades, route orders, withdraw funds, or custody assets.</w:t>
+        <w:t>OpenAI API generates user-requested educational AI Coach responses from the selected private records and plan context disclosed in the app.</w:t>
+      </w:r>
+    </w:p>
+    <w:p>
+      <w:pPr>
+        <w:pStyle w:val="ListBullet"/>
+        <w:spacing w:after="60"/>
+      </w:pPr>
+      <w:r>
+        <w:t>Expo Notifications and Apple Push Notification service provide optional device registration, business reminders, and separately opted-in promotional notifications.</w:t>
+      </w:r>
+    </w:p>
+    <w:p>
+      <w:pPr>
+        <w:pStyle w:val="ListBullet"/>
+        <w:spacing w:after="60"/>
+      </w:pPr>
+      <w:r>
+        <w:t>Resend sends account, security, support, and service-related email outside the iOS app.</w:t>
+      </w:r>
+    </w:p>
+    <w:p>
+      <w:pPr>
+        <w:pStyle w:val="ListBullet"/>
+        <w:spacing w:after="60"/>
+      </w:pPr>
+      <w:r>
+        <w:t>Stripe manages memberships initiated outside the submitted iOS app. The iOS app contains no pricing, checkout, purchase, upgrade, or external purchase-link flow.</w:t>
+      </w:r>
+    </w:p>
+    <w:p>
+      <w:pPr>
+        <w:pStyle w:val="ListBullet"/>
+        <w:spacing w:after="60"/>
+      </w:pPr>
+      <w:r>
+        <w:t>SnapTrade and Webull integration code supports planned direct broker connectivity, but direct broker connections are disabled in the submitted iOS build pending provider approvals. The app does not execute or route trades.</w:t>
       </w:r>
     </w:p>
     <w:p>
@@ -2527,23 +654,12 @@
         <w:keepNext/>
       </w:pPr>
       <w:r>
-        <w:t>5 Regional Differences</w:t>
+        <w:t>5 Regional differences</w:t>
       </w:r>
     </w:p>
     <w:p>
-      <w:pPr>
-        <w:spacing w:after="120" w:line="269" w:lineRule="auto"/>
-      </w:pPr>
       <w:r>
-        <w:t>The submitted app provides the same core features and content in every supported App Store region. Users may choose English or Spanish. Optional notifications depend on device permission and Apple service availability. Direct broker connections are disabled in this build, so there are no regional broker-feature differences in the submitted binary.</w:t>
-      </w:r>
-    </w:p>
-    <w:p>
-      <w:pPr>
-        <w:spacing w:after="120" w:line="269" w:lineRule="auto"/>
-      </w:pPr>
-      <w:r>
-        <w:t>The educational-use limitations, no-advice disclosures, privacy controls, account deletion capability, and access rules apply consistently in all supported regions. Local law may provide users with additional privacy or consumer rights, which are addressed through the Privacy Policy and Terms and Conditions.</w:t>
+        <w:t>The submitted app provides the same core features and content in all supported regions. Users may choose English or Spanish. Optional notifications depend on the user's device permission and Apple service availability. Direct broker connections are disabled in this build, so there is no regional broker-feature difference in the submitted binary.</w:t>
       </w:r>
     </w:p>
     <w:p>
@@ -2552,57 +668,17 @@
         <w:keepNext/>
       </w:pPr>
       <w:r>
-        <w:t>6 Regulated Activity and Protected Material</w:t>
+        <w:t>6 Regulated activity and protected third party material</w:t>
       </w:r>
     </w:p>
     <w:p>
-      <w:pPr>
-        <w:pStyle w:val="Heading2"/>
-        <w:keepNext/>
-      </w:pPr>
       <w:r>
-        <w:t>Regulated activity</w:t>
+        <w:t>NeuroTrader is educational recordkeeping, simulation, analytics, and business-discipline software. It is not a broker-dealer, investment adviser, exchange, custodian, or trade-execution service. It does not provide individualized financial advice or promise any trading or capital outcome.</w:t>
       </w:r>
     </w:p>
     <w:p>
-      <w:pPr>
-        <w:spacing w:after="120" w:line="269" w:lineRule="auto"/>
-      </w:pPr>
       <w:r>
-        <w:t>NeuroTrader is operated by SG PAX CORP. as educational recordkeeping, simulation, analytics, planning, and business-accountability software. The submitted app is not a broker-dealer, investment adviser, exchange, custodian, prop firm, or trade-execution service. It does not open brokerage accounts, accept deposits, hold customer assets, execute or route orders, manage portfolios, or exercise trading discretion for users.</w:t>
-      </w:r>
-    </w:p>
-    <w:p>
-      <w:pPr>
-        <w:spacing w:after="120" w:line="269" w:lineRule="auto"/>
-      </w:pPr>
-      <w:r>
-        <w:t>The app does not recommend that a user buy, sell, hold, or trade a specific security. AI Coach and other analytical outputs are generated for educational reflection based on user-provided records. They are not individualized financial, investment, trading, legal, tax, or accounting advice and do not guarantee results.</w:t>
-      </w:r>
-    </w:p>
-    <w:p>
-      <w:pPr>
-        <w:pStyle w:val="Heading2"/>
-        <w:keepNext/>
-      </w:pPr>
-      <w:r>
-        <w:t>Protected third party material</w:t>
-      </w:r>
-    </w:p>
-    <w:p>
-      <w:pPr>
-        <w:spacing w:after="120" w:line="269" w:lineRule="auto"/>
-      </w:pPr>
-      <w:r>
-        <w:t>The submitted iOS app does not display, reproduce, distribute, or provide access to third-party curriculum books, paid educational PDFs, or protected training material. No third-party curriculum PDF is included in the app binary or delivered to users through the submitted app. Product copy, workflows, calculations, interface elements, and simulated review data are owned by the developer or were created specifically for NeuroTrader.</w:t>
-      </w:r>
-    </w:p>
-    <w:p>
-      <w:pPr>
-        <w:spacing w:after="120" w:line="269" w:lineRule="auto"/>
-      </w:pPr>
-      <w:r>
-        <w:t>Third-party names or services, when referenced in operational disclosures, are used only to identify compatibility or a service provider and do not imply sponsorship, endorsement, or affiliation. SG PAX CORP. can provide organizational documentation or additional clarification if requested by App Review.</w:t>
+        <w:t>The submitted iOS app does not display, reproduce, or distribute third-party curriculum books, paid market publications, or other protected training material. Product copy, workflows, calculations, and synthetic sample records shown in the app are owned by SG PAX Corp or were created specifically for the product. No market-data redistribution or protected third-party content is included in the submitted mobile experience.</w:t>
       </w:r>
     </w:p>
     <w:p>
@@ -2611,278 +687,75 @@
         <w:keepNext/>
       </w:pPr>
       <w:r>
-        <w:t>Reviewer Support</w:t>
+        <w:t>Reviewer support and final submission notes</w:t>
       </w:r>
-    </w:p>
-    <w:tbl>
-      <w:tblPr>
-        <w:tblStyle w:val="TableGrid"/>
-        <w:tblW w:type="auto" w:w="0"/>
-        <w:jc w:val="center"/>
-        <w:tblLayout w:type="fixed"/>
-        <w:tblLook w:firstColumn="1" w:firstRow="1" w:lastColumn="0" w:lastRow="0" w:noHBand="0" w:noVBand="1" w:val="04A0"/>
-        <w:tblBorders>
-          <w:top w:val="single" w:sz="6" w:space="0" w:color="D9D9D9"/>
-          <w:left w:val="single" w:sz="6" w:space="0" w:color="D9D9D9"/>
-          <w:bottom w:val="single" w:sz="6" w:space="0" w:color="D9D9D9"/>
-          <w:right w:val="single" w:sz="6" w:space="0" w:color="D9D9D9"/>
-          <w:insideH w:val="single" w:sz="6" w:space="0" w:color="D9D9D9"/>
-          <w:insideV w:val="single" w:sz="6" w:space="0" w:color="D9D9D9"/>
-        </w:tblBorders>
-      </w:tblPr>
-      <w:tblGrid>
-        <w:gridCol w:w="2376"/>
-        <w:gridCol w:w="7560"/>
-      </w:tblGrid>
-      <w:tr>
-        <w:trPr>
-          <w:cantSplit/>
-          <w:tblHeader w:val="true"/>
-        </w:trPr>
-        <w:tc>
-          <w:tcPr>
-            <w:tcW w:type="dxa" w:w="2376"/>
-            <w:vAlign w:val="center"/>
-            <w:tcMar>
-              <w:top w:w="110" w:type="dxa"/>
-              <w:start w:w="130" w:type="dxa"/>
-              <w:bottom w:w="110" w:type="dxa"/>
-              <w:end w:w="130" w:type="dxa"/>
-            </w:tcMar>
-            <w:shd w:fill="17324D"/>
-          </w:tcPr>
-          <w:p>
-            <w:pPr>
-              <w:spacing w:after="0" w:line="252" w:lineRule="auto"/>
-            </w:pPr>
-            <w:r>
-              <w:rPr>
-                <w:rFonts w:ascii="Aptos" w:hAnsi="Aptos"/>
-                <w:b/>
-                <w:color w:val="FFFFFF"/>
-                <w:sz w:val="19"/>
-              </w:rPr>
-              <w:t>Reviewer resource</w:t>
-            </w:r>
-          </w:p>
-        </w:tc>
-        <w:tc>
-          <w:tcPr>
-            <w:tcW w:type="dxa" w:w="7560"/>
-            <w:vAlign w:val="center"/>
-            <w:tcMar>
-              <w:top w:w="110" w:type="dxa"/>
-              <w:start w:w="130" w:type="dxa"/>
-              <w:bottom w:w="110" w:type="dxa"/>
-              <w:end w:w="130" w:type="dxa"/>
-            </w:tcMar>
-            <w:shd w:fill="17324D"/>
-          </w:tcPr>
-          <w:p>
-            <w:pPr>
-              <w:spacing w:after="0" w:line="252" w:lineRule="auto"/>
-            </w:pPr>
-            <w:r>
-              <w:rPr>
-                <w:rFonts w:ascii="Aptos" w:hAnsi="Aptos"/>
-                <w:b/>
-                <w:color w:val="FFFFFF"/>
-                <w:sz w:val="19"/>
-              </w:rPr>
-              <w:t>Information</w:t>
-            </w:r>
-          </w:p>
-        </w:tc>
-      </w:tr>
-      <w:tr>
-        <w:trPr>
-          <w:cantSplit/>
-        </w:trPr>
-        <w:tc>
-          <w:tcPr>
-            <w:tcW w:type="dxa" w:w="2376"/>
-            <w:vAlign w:val="center"/>
-            <w:tcMar>
-              <w:top w:w="110" w:type="dxa"/>
-              <w:start w:w="130" w:type="dxa"/>
-              <w:bottom w:w="110" w:type="dxa"/>
-              <w:end w:w="130" w:type="dxa"/>
-            </w:tcMar>
-          </w:tcPr>
-          <w:p>
-            <w:pPr>
-              <w:spacing w:after="0" w:line="252" w:lineRule="auto"/>
-            </w:pPr>
-            <w:r>
-              <w:rPr>
-                <w:rFonts w:ascii="Aptos" w:hAnsi="Aptos"/>
-                <w:b/>
-                <w:sz w:val="19"/>
-              </w:rPr>
-              <w:t>Support email</w:t>
-            </w:r>
-          </w:p>
-        </w:tc>
-        <w:tc>
-          <w:tcPr>
-            <w:tcW w:type="dxa" w:w="7560"/>
-            <w:vAlign w:val="center"/>
-            <w:tcMar>
-              <w:top w:w="110" w:type="dxa"/>
-              <w:start w:w="130" w:type="dxa"/>
-              <w:bottom w:w="110" w:type="dxa"/>
-              <w:end w:w="130" w:type="dxa"/>
-            </w:tcMar>
-          </w:tcPr>
-          <w:p>
-            <w:pPr>
-              <w:spacing w:after="0" w:line="252" w:lineRule="auto"/>
-            </w:pPr>
-            <w:r>
-              <w:rPr>
-                <w:rFonts w:ascii="Aptos" w:hAnsi="Aptos"/>
-                <w:sz w:val="19"/>
-              </w:rPr>
-              <w:t>support@neurotrader-journal.com</w:t>
-            </w:r>
-          </w:p>
-        </w:tc>
-      </w:tr>
-      <w:tr>
-        <w:trPr>
-          <w:cantSplit/>
-        </w:trPr>
-        <w:tc>
-          <w:tcPr>
-            <w:tcW w:type="dxa" w:w="2376"/>
-            <w:vAlign w:val="center"/>
-            <w:tcMar>
-              <w:top w:w="110" w:type="dxa"/>
-              <w:start w:w="130" w:type="dxa"/>
-              <w:bottom w:w="110" w:type="dxa"/>
-              <w:end w:w="130" w:type="dxa"/>
-            </w:tcMar>
-            <w:shd w:fill="F5F7F9"/>
-          </w:tcPr>
-          <w:p>
-            <w:pPr>
-              <w:spacing w:after="0" w:line="252" w:lineRule="auto"/>
-            </w:pPr>
-            <w:r>
-              <w:rPr>
-                <w:rFonts w:ascii="Aptos" w:hAnsi="Aptos"/>
-                <w:b/>
-                <w:sz w:val="19"/>
-              </w:rPr>
-              <w:t>Privacy Policy</w:t>
-            </w:r>
-          </w:p>
-        </w:tc>
-        <w:tc>
-          <w:tcPr>
-            <w:tcW w:type="dxa" w:w="7560"/>
-            <w:vAlign w:val="center"/>
-            <w:tcMar>
-              <w:top w:w="110" w:type="dxa"/>
-              <w:start w:w="130" w:type="dxa"/>
-              <w:bottom w:w="110" w:type="dxa"/>
-              <w:end w:w="130" w:type="dxa"/>
-            </w:tcMar>
-            <w:shd w:fill="F5F7F9"/>
-          </w:tcPr>
-          <w:p>
-            <w:pPr>
-              <w:spacing w:after="0" w:line="252" w:lineRule="auto"/>
-            </w:pPr>
-            <w:r>
-              <w:rPr>
-                <w:rFonts w:ascii="Aptos" w:hAnsi="Aptos"/>
-                <w:sz w:val="19"/>
-              </w:rPr>
-              <w:t>https://www.neurotrader-journal.com/privacy</w:t>
-            </w:r>
-          </w:p>
-        </w:tc>
-      </w:tr>
-      <w:tr>
-        <w:trPr>
-          <w:cantSplit/>
-        </w:trPr>
-        <w:tc>
-          <w:tcPr>
-            <w:tcW w:type="dxa" w:w="2376"/>
-            <w:vAlign w:val="center"/>
-            <w:tcMar>
-              <w:top w:w="110" w:type="dxa"/>
-              <w:start w:w="130" w:type="dxa"/>
-              <w:bottom w:w="110" w:type="dxa"/>
-              <w:end w:w="130" w:type="dxa"/>
-            </w:tcMar>
-          </w:tcPr>
-          <w:p>
-            <w:pPr>
-              <w:spacing w:after="0" w:line="252" w:lineRule="auto"/>
-            </w:pPr>
-            <w:r>
-              <w:rPr>
-                <w:rFonts w:ascii="Aptos" w:hAnsi="Aptos"/>
-                <w:b/>
-                <w:sz w:val="19"/>
-              </w:rPr>
-              <w:t>Terms and Conditions</w:t>
-            </w:r>
-          </w:p>
-        </w:tc>
-        <w:tc>
-          <w:tcPr>
-            <w:tcW w:type="dxa" w:w="7560"/>
-            <w:vAlign w:val="center"/>
-            <w:tcMar>
-              <w:top w:w="110" w:type="dxa"/>
-              <w:start w:w="130" w:type="dxa"/>
-              <w:bottom w:w="110" w:type="dxa"/>
-              <w:end w:w="130" w:type="dxa"/>
-            </w:tcMar>
-          </w:tcPr>
-          <w:p>
-            <w:pPr>
-              <w:spacing w:after="0" w:line="252" w:lineRule="auto"/>
-            </w:pPr>
-            <w:r>
-              <w:rPr>
-                <w:rFonts w:ascii="Aptos" w:hAnsi="Aptos"/>
-                <w:sz w:val="19"/>
-              </w:rPr>
-              <w:t>https://www.neurotrader-journal.com/terms</w:t>
-            </w:r>
-          </w:p>
-        </w:tc>
-      </w:tr>
-    </w:tbl>
-    <w:p>
-      <w:pPr>
-        <w:spacing w:after="20"/>
-      </w:pPr>
     </w:p>
     <w:p>
       <w:pPr>
-        <w:spacing w:after="0" w:line="269" w:lineRule="auto"/>
+        <w:pStyle w:val="ListBullet"/>
+        <w:spacing w:after="60"/>
       </w:pPr>
       <w:r>
-        <w:t>We respectfully request review of the latest submitted build using the supplied demonstration accounts and attached physical-device recording. We are available to provide any additional information required to complete the review.</w:t>
+        <w:t>Support email: support@neurotrader-journal.com</w:t>
+      </w:r>
+    </w:p>
+    <w:p>
+      <w:pPr>
+        <w:pStyle w:val="ListBullet"/>
+        <w:spacing w:after="60"/>
+      </w:pPr>
+      <w:r>
+        <w:t>Support URL: https://www.neurotrader-journal.com/contact</w:t>
+      </w:r>
+    </w:p>
+    <w:p>
+      <w:pPr>
+        <w:pStyle w:val="ListBullet"/>
+        <w:spacing w:after="60"/>
+      </w:pPr>
+      <w:r>
+        <w:t>Privacy Policy URL: https://www.neurotrader-journal.com/privacy</w:t>
+      </w:r>
+    </w:p>
+    <w:p>
+      <w:pPr>
+        <w:pStyle w:val="ListBullet"/>
+        <w:spacing w:after="60"/>
+      </w:pPr>
+      <w:r>
+        <w:t>Terms and Conditions URL: https://www.neurotrader-journal.com/terms</w:t>
+      </w:r>
+    </w:p>
+    <w:p>
+      <w:pPr>
+        <w:pStyle w:val="ListBullet"/>
+        <w:spacing w:after="60"/>
+      </w:pPr>
+      <w:r>
+        <w:t>All preloaded balances, trades, journals, metrics, and outcomes are synthetic and labeled for demonstration and App Review only.</w:t>
+      </w:r>
+    </w:p>
+    <w:p>
+      <w:pPr>
+        <w:spacing w:before="200"/>
+      </w:pPr>
+      <w:r>
+        <w:rPr>
+          <w:b/>
+        </w:rPr>
+        <w:t>Submitted by SG PAX Corp</w:t>
+        <w:br/>
+      </w:r>
+      <w:r>
+        <w:t>NeuroTrader Product Team</w:t>
       </w:r>
     </w:p>
     <w:sectPr>
       <w:headerReference w:type="default" r:id="rId9"/>
-      <w:headerReference w:type="even" r:id="rId10"/>
-      <w:headerReference w:type="first" r:id="rId11"/>
-      <w:footerReference w:type="default" r:id="rId12"/>
-      <w:footerReference w:type="even" r:id="rId13"/>
-      <w:footerReference w:type="first" r:id="rId14"/>
+      <w:footerReference w:type="default" r:id="rId10"/>
       <w:pgSz w:w="12240" w:h="15840"/>
-      <w:pgMar w:top="979" w:right="1123" w:bottom="893" w:left="1123" w:header="432" w:footer="432" w:gutter="0"/>
+      <w:pgMar w:top="792" w:right="1008" w:bottom="792" w:left="1008" w:header="720" w:footer="720" w:gutter="0"/>
       <w:cols w:space="720"/>
-      <w:titlePg/>
       <w:docGrid w:linePitch="360"/>
     </w:sectPr>
   </w:body>
@@ -2894,86 +767,14 @@
   <w:p>
     <w:pPr>
       <w:pStyle w:val="Footer"/>
-      <w:jc w:val="right"/>
+      <w:jc w:val="center"/>
     </w:pPr>
     <w:r>
       <w:rPr>
-        <w:rFonts w:ascii="Aptos" w:hAnsi="Aptos"/>
-        <w:color w:val="667085"/>
+        <w:color w:val="475569"/>
         <w:sz w:val="16"/>
       </w:rPr>
-      <w:t xml:space="preserve">SG PAX CORP.  |  Confidential review information     </w:t>
-    </w:r>
-    <w:r>
-      <w:rPr>
-        <w:rFonts w:ascii="Aptos" w:hAnsi="Aptos"/>
-        <w:color w:val="667085"/>
-        <w:sz w:val="18"/>
-      </w:rPr>
-      <w:t xml:space="preserve">Page </w:t>
-      <w:fldChar w:fldCharType="begin"/>
-      <w:instrText xml:space="preserve">PAGE</w:instrText>
-      <w:fldChar w:fldCharType="end"/>
-    </w:r>
-  </w:p>
-</w:ftr>
-</file>
-
-<file path=word/footer2.xml><?xml version="1.0" encoding="utf-8"?>
-<w:ftr xmlns:m="http://schemas.openxmlformats.org/officeDocument/2006/math" xmlns:mc="http://schemas.openxmlformats.org/markup-compatibility/2006" xmlns:mo="http://schemas.microsoft.com/office/mac/office/2008/main" xmlns:mv="urn:schemas-microsoft-com:mac:vml" xmlns:o="urn:schemas-microsoft-com:office:office" xmlns:r="http://schemas.openxmlformats.org/officeDocument/2006/relationships" xmlns:v="urn:schemas-microsoft-com:vml" xmlns:w10="urn:schemas-microsoft-com:office:word" xmlns:w14="http://schemas.microsoft.com/office/word/2010/wordml" xmlns:w="http://schemas.openxmlformats.org/wordprocessingml/2006/main" xmlns:wne="http://schemas.microsoft.com/office/word/2006/wordml" xmlns:wp14="http://schemas.microsoft.com/office/word/2010/wordprocessingDrawing" xmlns:wp="http://schemas.openxmlformats.org/drawingml/2006/wordprocessingDrawing" xmlns:wpc="http://schemas.microsoft.com/office/word/2010/wordprocessingCanvas" xmlns:wpg="http://schemas.microsoft.com/office/word/2010/wordprocessingGroup" xmlns:wpi="http://schemas.microsoft.com/office/word/2010/wordprocessingInk" xmlns:wps="http://schemas.microsoft.com/office/word/2010/wordprocessingShape" mc:Ignorable="w14 wp14">
-  <w:p>
-    <w:pPr>
-      <w:pStyle w:val="Footer"/>
-      <w:jc w:val="right"/>
-    </w:pPr>
-    <w:r>
-      <w:rPr>
-        <w:rFonts w:ascii="Aptos" w:hAnsi="Aptos"/>
-        <w:color w:val="667085"/>
-        <w:sz w:val="16"/>
-      </w:rPr>
-      <w:t xml:space="preserve">SG PAX CORP.  |  Confidential review information     </w:t>
-    </w:r>
-    <w:r>
-      <w:rPr>
-        <w:rFonts w:ascii="Aptos" w:hAnsi="Aptos"/>
-        <w:color w:val="667085"/>
-        <w:sz w:val="18"/>
-      </w:rPr>
-      <w:t xml:space="preserve">Page </w:t>
-      <w:fldChar w:fldCharType="begin"/>
-      <w:instrText xml:space="preserve">PAGE</w:instrText>
-      <w:fldChar w:fldCharType="end"/>
-    </w:r>
-  </w:p>
-</w:ftr>
-</file>
-
-<file path=word/footer3.xml><?xml version="1.0" encoding="utf-8"?>
-<w:ftr xmlns:m="http://schemas.openxmlformats.org/officeDocument/2006/math" xmlns:mc="http://schemas.openxmlformats.org/markup-compatibility/2006" xmlns:mo="http://schemas.microsoft.com/office/mac/office/2008/main" xmlns:mv="urn:schemas-microsoft-com:mac:vml" xmlns:o="urn:schemas-microsoft-com:office:office" xmlns:r="http://schemas.openxmlformats.org/officeDocument/2006/relationships" xmlns:v="urn:schemas-microsoft-com:vml" xmlns:w10="urn:schemas-microsoft-com:office:word" xmlns:w14="http://schemas.microsoft.com/office/word/2010/wordml" xmlns:w="http://schemas.openxmlformats.org/wordprocessingml/2006/main" xmlns:wne="http://schemas.microsoft.com/office/word/2006/wordml" xmlns:wp14="http://schemas.microsoft.com/office/word/2010/wordprocessingDrawing" xmlns:wp="http://schemas.openxmlformats.org/drawingml/2006/wordprocessingDrawing" xmlns:wpc="http://schemas.microsoft.com/office/word/2010/wordprocessingCanvas" xmlns:wpg="http://schemas.microsoft.com/office/word/2010/wordprocessingGroup" xmlns:wpi="http://schemas.microsoft.com/office/word/2010/wordprocessingInk" xmlns:wps="http://schemas.microsoft.com/office/word/2010/wordprocessingShape" mc:Ignorable="w14 wp14">
-  <w:p>
-    <w:pPr>
-      <w:pStyle w:val="Footer"/>
-      <w:jc w:val="right"/>
-    </w:pPr>
-    <w:r>
-      <w:rPr>
-        <w:rFonts w:ascii="Aptos" w:hAnsi="Aptos"/>
-        <w:color w:val="667085"/>
-        <w:sz w:val="16"/>
-      </w:rPr>
-      <w:t xml:space="preserve">SG PAX CORP.  |  Confidential review information     </w:t>
-    </w:r>
-    <w:r>
-      <w:rPr>
-        <w:rFonts w:ascii="Aptos" w:hAnsi="Aptos"/>
-        <w:color w:val="667085"/>
-        <w:sz w:val="18"/>
-      </w:rPr>
-      <w:t xml:space="preserve">Page </w:t>
-      <w:fldChar w:fldCharType="begin"/>
-      <w:instrText xml:space="preserve">PAGE</w:instrText>
-      <w:fldChar w:fldCharType="end"/>
+      <w:t>SG PAX Corp  |  NeuroTrader  |  support@neurotrader-journal.com</w:t>
     </w:r>
   </w:p>
 </w:ftr>
@@ -2984,61 +785,98 @@
   <w:p>
     <w:pPr>
       <w:pStyle w:val="Header"/>
-      <w:spacing w:after="0"/>
-      <w:jc w:val="right"/>
-    </w:pPr>
-    <w:r>
-      <w:rPr>
-        <w:rFonts w:ascii="Arial" w:hAnsi="Arial"/>
-        <w:b/>
-        <w:color w:val="00A98F"/>
-        <w:sz w:val="16"/>
-      </w:rPr>
-      <w:t>SG PAX CORP.   |   NEUROTRADER APP REVIEW RESPONSE</w:t>
-    </w:r>
+    </w:pPr>
   </w:p>
-</w:hdr>
-</file>
-
-<file path=word/header2.xml><?xml version="1.0" encoding="utf-8"?>
-<w:hdr xmlns:m="http://schemas.openxmlformats.org/officeDocument/2006/math" xmlns:mc="http://schemas.openxmlformats.org/markup-compatibility/2006" xmlns:mo="http://schemas.microsoft.com/office/mac/office/2008/main" xmlns:mv="urn:schemas-microsoft-com:mac:vml" xmlns:o="urn:schemas-microsoft-com:office:office" xmlns:r="http://schemas.openxmlformats.org/officeDocument/2006/relationships" xmlns:v="urn:schemas-microsoft-com:vml" xmlns:w10="urn:schemas-microsoft-com:office:word" xmlns:w14="http://schemas.microsoft.com/office/word/2010/wordml" xmlns:w="http://schemas.openxmlformats.org/wordprocessingml/2006/main" xmlns:wne="http://schemas.microsoft.com/office/word/2006/wordml" xmlns:wp14="http://schemas.microsoft.com/office/word/2010/wordprocessingDrawing" xmlns:wp="http://schemas.openxmlformats.org/drawingml/2006/wordprocessingDrawing" xmlns:wpc="http://schemas.microsoft.com/office/word/2010/wordprocessingCanvas" xmlns:wpg="http://schemas.microsoft.com/office/word/2010/wordprocessingGroup" xmlns:wpi="http://schemas.microsoft.com/office/word/2010/wordprocessingInk" xmlns:wps="http://schemas.microsoft.com/office/word/2010/wordprocessingShape" mc:Ignorable="w14 wp14">
-  <w:p>
-    <w:pPr>
-      <w:pStyle w:val="Header"/>
-      <w:spacing w:after="0"/>
-      <w:jc w:val="right"/>
-    </w:pPr>
-    <w:r>
-      <w:rPr>
-        <w:rFonts w:ascii="Arial" w:hAnsi="Arial"/>
-        <w:b/>
-        <w:color w:val="00A98F"/>
-        <w:sz w:val="16"/>
-      </w:rPr>
-      <w:t>SG PAX CORP.   |   NEUROTRADER APP REVIEW RESPONSE</w:t>
-    </w:r>
-  </w:p>
-</w:hdr>
-</file>
-
-<file path=word/header3.xml><?xml version="1.0" encoding="utf-8"?>
-<w:hdr xmlns:m="http://schemas.openxmlformats.org/officeDocument/2006/math" xmlns:mc="http://schemas.openxmlformats.org/markup-compatibility/2006" xmlns:mo="http://schemas.microsoft.com/office/mac/office/2008/main" xmlns:mv="urn:schemas-microsoft-com:mac:vml" xmlns:o="urn:schemas-microsoft-com:office:office" xmlns:r="http://schemas.openxmlformats.org/officeDocument/2006/relationships" xmlns:v="urn:schemas-microsoft-com:vml" xmlns:w10="urn:schemas-microsoft-com:office:word" xmlns:w14="http://schemas.microsoft.com/office/word/2010/wordml" xmlns:w="http://schemas.openxmlformats.org/wordprocessingml/2006/main" xmlns:wne="http://schemas.microsoft.com/office/word/2006/wordml" xmlns:wp14="http://schemas.microsoft.com/office/word/2010/wordprocessingDrawing" xmlns:wp="http://schemas.openxmlformats.org/drawingml/2006/wordprocessingDrawing" xmlns:wpc="http://schemas.microsoft.com/office/word/2010/wordprocessingCanvas" xmlns:wpg="http://schemas.microsoft.com/office/word/2010/wordprocessingGroup" xmlns:wpi="http://schemas.microsoft.com/office/word/2010/wordprocessingInk" xmlns:wps="http://schemas.microsoft.com/office/word/2010/wordprocessingShape" mc:Ignorable="w14 wp14">
-  <w:p>
-    <w:pPr>
-      <w:pStyle w:val="Header"/>
-      <w:spacing w:after="0"/>
-      <w:jc w:val="right"/>
-    </w:pPr>
-    <w:r>
-      <w:rPr>
-        <w:rFonts w:ascii="Arial" w:hAnsi="Arial"/>
-        <w:b/>
-        <w:color w:val="00A98F"/>
-        <w:sz w:val="16"/>
-      </w:rPr>
-      <w:t>SG PAX CORP.   |   NEUROTRADER APP REVIEW RESPONSE</w:t>
-    </w:r>
-  </w:p>
+  <w:tbl>
+    <w:tblPr>
+      <w:tblW w:type="auto" w:w="0"/>
+      <w:tblLayout w:type="fixed"/>
+      <w:tblLook w:firstColumn="1" w:firstRow="1" w:lastColumn="0" w:lastRow="0" w:noHBand="0" w:noVBand="1" w:val="04A0"/>
+    </w:tblPr>
+    <w:tblGrid>
+      <w:gridCol w:w="6048"/>
+      <w:gridCol w:w="4176"/>
+    </w:tblGrid>
+    <w:tr>
+      <w:tc>
+        <w:tcPr>
+          <w:tcW w:type="dxa" w:w="5112"/>
+          <w:tcMar>
+            <w:top w:w="0" w:type="dxa"/>
+            <w:start w:w="0" w:type="dxa"/>
+            <w:bottom w:w="0" w:type="dxa"/>
+            <w:end w:w="0" w:type="dxa"/>
+          </w:tcMar>
+        </w:tcPr>
+        <w:p>
+          <w:r>
+            <w:drawing>
+              <wp:inline xmlns:a="http://schemas.openxmlformats.org/drawingml/2006/main" xmlns:pic="http://schemas.openxmlformats.org/drawingml/2006/picture">
+                <wp:extent cx="2606040" cy="413047"/>
+                <wp:docPr id="1" name="Picture 1"/>
+                <wp:cNvGraphicFramePr>
+                  <a:graphicFrameLocks noChangeAspect="1"/>
+                </wp:cNvGraphicFramePr>
+                <a:graphic>
+                  <a:graphicData uri="http://schemas.openxmlformats.org/drawingml/2006/picture">
+                    <pic:pic>
+                      <pic:nvPicPr>
+                        <pic:cNvPr id="0" name="neurotrader-logo-web.png"/>
+                        <pic:cNvPicPr/>
+                      </pic:nvPicPr>
+                      <pic:blipFill>
+                        <a:blip r:embed="rId1"/>
+                        <a:stretch>
+                          <a:fillRect/>
+                        </a:stretch>
+                      </pic:blipFill>
+                      <pic:spPr>
+                        <a:xfrm>
+                          <a:off x="0" y="0"/>
+                          <a:ext cx="2606040" cy="413047"/>
+                        </a:xfrm>
+                        <a:prstGeom prst="rect"/>
+                      </pic:spPr>
+                    </pic:pic>
+                  </a:graphicData>
+                </a:graphic>
+              </wp:inline>
+            </w:drawing>
+          </w:r>
+        </w:p>
+      </w:tc>
+      <w:tc>
+        <w:tcPr>
+          <w:tcW w:type="dxa" w:w="5112"/>
+          <w:tcMar>
+            <w:top w:w="0" w:type="dxa"/>
+            <w:start w:w="0" w:type="dxa"/>
+            <w:bottom w:w="0" w:type="dxa"/>
+            <w:end w:w="0" w:type="dxa"/>
+          </w:tcMar>
+        </w:tcPr>
+        <w:p>
+          <w:pPr>
+            <w:jc w:val="right"/>
+          </w:pPr>
+          <w:r>
+            <w:rPr>
+              <w:b/>
+            </w:rPr>
+            <w:t>SG PAX Corp</w:t>
+            <w:br/>
+          </w:r>
+          <w:r>
+            <w:t>NeuroTrader Product Team</w:t>
+            <w:br/>
+          </w:r>
+          <w:r>
+            <w:t>September 10, 2026</w:t>
+          </w:r>
+        </w:p>
+      </w:tc>
+    </w:tr>
+  </w:tbl>
 </w:hdr>
 </file>
 
@@ -3410,8 +1248,8 @@
     </w:pPr>
     <w:rPr>
       <w:rFonts w:ascii="Aptos" w:hAnsi="Aptos"/>
-      <w:color w:val="000000"/>
-      <w:sz w:val="21"/>
+      <w:color w:val="0F172A"/>
+      <w:sz w:val="19"/>
     </w:rPr>
   </w:style>
   <w:style w:type="paragraph" w:styleId="Header">
@@ -3469,14 +1307,14 @@
     <w:pPr>
       <w:keepNext/>
       <w:keepLines/>
-      <w:spacing w:before="300" w:after="140"/>
+      <w:spacing w:before="240" w:after="100"/>
       <w:outlineLvl w:val="0"/>
     </w:pPr>
     <w:rPr>
       <w:rFonts w:asciiTheme="majorHAnsi" w:eastAsiaTheme="majorEastAsia" w:hAnsiTheme="majorHAnsi" w:cstheme="majorBidi" w:ascii="Aptos Display" w:hAnsi="Aptos Display"/>
       <w:b/>
       <w:bCs/>
-      <w:color w:val="000000"/>
+      <w:color w:val="0F9F91"/>
       <w:sz w:val="30"/>
       <w:szCs w:val="28"/>
     </w:rPr>
@@ -3493,15 +1331,15 @@
     <w:pPr>
       <w:keepNext/>
       <w:keepLines/>
-      <w:spacing w:before="200" w:after="80"/>
+      <w:spacing w:before="200" w:after="0"/>
       <w:outlineLvl w:val="1"/>
     </w:pPr>
     <w:rPr>
-      <w:rFonts w:asciiTheme="majorHAnsi" w:eastAsiaTheme="majorEastAsia" w:hAnsiTheme="majorHAnsi" w:cstheme="majorBidi" w:ascii="Aptos Display" w:hAnsi="Aptos Display"/>
+      <w:rFonts w:asciiTheme="majorHAnsi" w:eastAsiaTheme="majorEastAsia" w:hAnsiTheme="majorHAnsi" w:cstheme="majorBidi"/>
       <w:b/>
       <w:bCs/>
-      <w:color w:val="000000"/>
-      <w:sz w:val="23"/>
+      <w:color w:val="4F81BD" w:themeColor="accent1"/>
+      <w:sz w:val="26"/>
       <w:szCs w:val="26"/>
     </w:rPr>
   </w:style>
@@ -3755,16 +1593,19 @@
     <w:qFormat/>
     <w:rsid w:val="00FC693F"/>
     <w:pPr>
-      <w:spacing w:after="100" w:line="240" w:lineRule="auto"/>
+      <w:pBdr>
+        <w:bottom w:val="single" w:sz="8" w:space="4" w:color="4F81BD" w:themeColor="accent1"/>
+      </w:pBdr>
+      <w:spacing w:after="300" w:line="240" w:lineRule="auto"/>
       <w:contextualSpacing/>
     </w:pPr>
     <w:rPr>
       <w:rFonts w:asciiTheme="majorHAnsi" w:eastAsiaTheme="majorEastAsia" w:hAnsiTheme="majorHAnsi" w:cstheme="majorBidi" w:ascii="Aptos Display" w:hAnsi="Aptos Display"/>
       <w:b/>
-      <w:color w:val="000000"/>
+      <w:color w:val="0F172A"/>
       <w:spacing w:val="5"/>
       <w:kern w:val="28"/>
-      <w:sz w:val="56"/>
+      <w:sz w:val="50"/>
       <w:szCs w:val="52"/>
     </w:rPr>
   </w:style>
@@ -3940,11 +1781,6 @@
       </w:numPr>
       <w:contextualSpacing/>
     </w:pPr>
-    <w:rPr>
-      <w:rFonts w:ascii="Aptos" w:hAnsi="Aptos"/>
-      <w:color w:val="000000"/>
-      <w:sz w:val="20"/>
-    </w:rPr>
   </w:style>
   <w:style w:type="paragraph" w:styleId="ListBullet2">
     <w:name w:val="List Bullet 2"/>
@@ -3958,11 +1794,6 @@
       </w:numPr>
       <w:contextualSpacing/>
     </w:pPr>
-    <w:rPr>
-      <w:rFonts w:ascii="Aptos" w:hAnsi="Aptos"/>
-      <w:color w:val="000000"/>
-      <w:sz w:val="20"/>
-    </w:rPr>
   </w:style>
   <w:style w:type="paragraph" w:styleId="ListBullet3">
     <w:name w:val="List Bullet 3"/>
@@ -3989,11 +1820,6 @@
       </w:numPr>
       <w:contextualSpacing/>
     </w:pPr>
-    <w:rPr>
-      <w:rFonts w:ascii="Aptos" w:hAnsi="Aptos"/>
-      <w:color w:val="000000"/>
-      <w:sz w:val="20"/>
-    </w:rPr>
   </w:style>
   <w:style w:type="paragraph" w:styleId="ListNumber2">
     <w:name w:val="List Number 2"/>

</xml_diff>

<commit_message>
fixing recording journalism and syncing
</commit_message>
<xml_diff>
--- a/docs/app-review/NeuroTrader_App_Review_Response.docx
+++ b/docs/app-review/NeuroTrader_App_Review_Response.docx
@@ -216,52 +216,257 @@
     </w:p>
     <w:p>
       <w:r>
-        <w:t>A separate uninterrupted recording captured on a physical iPhone running the latest available iOS version is attached to the Resolution Center reply. It begins from the iPhone Home Screen with a cold app launch and shows the normal review flow.</w:t>
+        <w:t>A separate uninterrupted recording captured on a physical iPhone running the latest available iOS version is attached to the Resolution Center reply. It begins from the iPhone Home Screen with a cold app launch. The sequence below explains what is shown and what each part confirms for App Review.</w:t>
       </w:r>
     </w:p>
     <w:p>
       <w:pPr>
-        <w:pStyle w:val="ListBullet"/>
-        <w:spacing w:after="60"/>
+        <w:spacing w:before="60"/>
       </w:pPr>
       <w:r>
-        <w:t>Launch Neuro Trader and show that the first screen is Sign in, with no account-creation or payment control.</w:t>
+        <w:rPr>
+          <w:b/>
+        </w:rPr>
+        <w:t>Sequence shown in the attached video</w:t>
       </w:r>
     </w:p>
     <w:p>
       <w:pPr>
-        <w:pStyle w:val="ListBullet"/>
-        <w:spacing w:after="60"/>
+        <w:spacing w:after="100"/>
+        <w:ind w:left="259" w:hanging="259"/>
       </w:pPr>
       <w:r>
-        <w:t>Log in with the main review account and open Business Center, Trading Business Plan, Execution Journal, P&amp;L, KPIs, Business Notebook, AI Coach, Settings, legal links, and sign out.</w:t>
+        <w:rPr>
+          <w:b/>
+        </w:rPr>
+        <w:t xml:space="preserve">1. </w:t>
+      </w:r>
+      <w:r>
+        <w:t>The recording starts on the physical iPhone Home Screen and opens Neuro Trader from a fully closed state. This confirms a normal cold launch of the submitted app.</w:t>
       </w:r>
     </w:p>
     <w:p>
       <w:pPr>
-        <w:pStyle w:val="ListBullet"/>
-        <w:spacing w:after="60"/>
+        <w:spacing w:after="100"/>
+        <w:ind w:left="259" w:hanging="259"/>
       </w:pPr>
       <w:r>
-        <w:t>Show paid-feature access through the preauthorized review account. No purchase is performed in the iOS app.</w:t>
+        <w:rPr>
+          <w:b/>
+        </w:rPr>
+        <w:t xml:space="preserve">2. </w:t>
+      </w:r>
+      <w:r>
+        <w:t>The first app screen is Sign in. The recording pauses here to show that the iOS app has no account-registration, pricing, checkout, upgrade, payment, or external purchase-link control.</w:t>
       </w:r>
     </w:p>
     <w:p>
       <w:pPr>
-        <w:pStyle w:val="ListBullet"/>
-        <w:spacing w:after="60"/>
+        <w:spacing w:after="100"/>
+        <w:ind w:left="259" w:hanging="259"/>
       </w:pPr>
       <w:r>
-        <w:t>Log in with the disposable deletion account and complete Settings, Danger zone, Delete account, including the email, DELETE phrase, and both confirmations.</w:t>
+        <w:rPr>
+          <w:b/>
+        </w:rPr>
+        <w:t xml:space="preserve">3. </w:t>
+      </w:r>
+      <w:r>
+        <w:t>The reviewer signs in with the main review account appreview@neurotrader-journal.com. The exact password is listed in Section 3 of this document.</w:t>
       </w:r>
     </w:p>
     <w:p>
       <w:pPr>
-        <w:pStyle w:val="ListBullet"/>
-        <w:spacing w:after="60"/>
+        <w:spacing w:after="100"/>
+        <w:ind w:left="259" w:hanging="259"/>
       </w:pPr>
       <w:r>
-        <w:t>The app has no public feed or public user-generated content. Journals, notebook entries, screenshots, and AI conversations are private to the authenticated account, so public reporting and blocking mechanisms do not apply.</w:t>
+        <w:rPr>
+          <w:b/>
+        </w:rPr>
+        <w:t xml:space="preserve">4. </w:t>
+      </w:r>
+      <w:r>
+        <w:t>Business Center opens with the preloaded Two-Year Growth Demo account. This is synthetic App Review data and is not a customer performance claim.</w:t>
+      </w:r>
+    </w:p>
+    <w:p>
+      <w:pPr>
+        <w:spacing w:after="100"/>
+        <w:ind w:left="259" w:hanging="259"/>
+      </w:pPr>
+      <w:r>
+        <w:rPr>
+          <w:b/>
+        </w:rPr>
+        <w:t xml:space="preserve">5. </w:t>
+      </w:r>
+      <w:r>
+        <w:t>Trading Business Plan shows the simulated $10,000 starting balance, $250,000 target, two-year dates, risk limits, and completed-cycle recommendation.</w:t>
+      </w:r>
+    </w:p>
+    <w:p>
+      <w:pPr>
+        <w:spacing w:after="100"/>
+        <w:ind w:left="259" w:hanging="259"/>
+      </w:pPr>
+      <w:r>
+        <w:rPr>
+          <w:b/>
+        </w:rPr>
+        <w:t xml:space="preserve">6. </w:t>
+      </w:r>
+      <w:r>
+        <w:t>Prepare recommended cycle is opened to demonstrate that the next cycle is prefilled from existing evidence and does not automatically increase risk. The demo plan is not overwritten or saved during the recording.</w:t>
+      </w:r>
+    </w:p>
+    <w:p>
+      <w:pPr>
+        <w:spacing w:after="100"/>
+        <w:ind w:left="259" w:hanging="259"/>
+      </w:pPr>
+      <w:r>
+        <w:rPr>
+          <w:b/>
+        </w:rPr>
+        <w:t xml:space="preserve">7. </w:t>
+      </w:r>
+      <w:r>
+        <w:t>The native Back and Return to Business Center controls are shown. The reviewer then opens P&amp;L and the September 10, 2026 Execution Journal entry to inspect populated stock, listed option-contract, cryptocurrency, and foreign-exchange transactions, private execution notes, and completed review fields.</w:t>
+      </w:r>
+    </w:p>
+    <w:p>
+      <w:pPr>
+        <w:spacing w:after="100"/>
+        <w:ind w:left="259" w:hanging="259"/>
+      </w:pPr>
+      <w:r>
+        <w:rPr>
+          <w:b/>
+        </w:rPr>
+        <w:t xml:space="preserve">8. </w:t>
+      </w:r>
+      <w:r>
+        <w:t>KPIs shows the objective performance measurements and drawdown calculated from the synthetic review records.</w:t>
+      </w:r>
+    </w:p>
+    <w:p>
+      <w:pPr>
+        <w:spacing w:after="100"/>
+        <w:ind w:left="259" w:hanging="259"/>
+      </w:pPr>
+      <w:r>
+        <w:rPr>
+          <w:b/>
+        </w:rPr>
+        <w:t xml:space="preserve">9. </w:t>
+      </w:r>
+      <w:r>
+        <w:t>Business Notebook shows the private operating book and one sample page. These records are visible only to the authenticated account.</w:t>
+      </w:r>
+    </w:p>
+    <w:p>
+      <w:pPr>
+        <w:spacing w:after="100"/>
+        <w:ind w:left="259" w:hanging="259"/>
+      </w:pPr>
+      <w:r>
+        <w:rPr>
+          <w:b/>
+        </w:rPr>
+        <w:t xml:space="preserve">10. </w:t>
+      </w:r>
+      <w:r>
+        <w:t>AI Coach receives the prompt Analyze my two-year plan objectively and returns an educational response grounded in the account's selected plan and private records.</w:t>
+      </w:r>
+    </w:p>
+    <w:p>
+      <w:pPr>
+        <w:spacing w:after="100"/>
+        <w:ind w:left="259" w:hanging="259"/>
+      </w:pPr>
+      <w:r>
+        <w:rPr>
+          <w:b/>
+        </w:rPr>
+        <w:t xml:space="preserve">11. </w:t>
+      </w:r>
+      <w:r>
+        <w:t>Settings shows notification choices, Privacy Policy, Terms and Conditions, Contact support, workspace reset, permanent account deletion, and Sign out.</w:t>
+      </w:r>
+    </w:p>
+    <w:p>
+      <w:pPr>
+        <w:spacing w:after="100"/>
+        <w:ind w:left="259" w:hanging="259"/>
+      </w:pPr>
+      <w:r>
+        <w:rPr>
+          <w:b/>
+        </w:rPr>
+        <w:t xml:space="preserve">12. </w:t>
+      </w:r>
+      <w:r>
+        <w:t>The reviewer signs out of the main account.</w:t>
+      </w:r>
+    </w:p>
+    <w:p>
+      <w:pPr>
+        <w:spacing w:after="100"/>
+        <w:ind w:left="259" w:hanging="259"/>
+      </w:pPr>
+      <w:r>
+        <w:rPr>
+          <w:b/>
+        </w:rPr>
+        <w:t xml:space="preserve">13. </w:t>
+      </w:r>
+      <w:r>
+        <w:t>The reviewer signs in with the disposable deletion account appreview-delete@neurotrader-journal.com. Its exact password is also listed in Section 3.</w:t>
+      </w:r>
+    </w:p>
+    <w:p>
+      <w:pPr>
+        <w:spacing w:after="100"/>
+        <w:ind w:left="259" w:hanging="259"/>
+      </w:pPr>
+      <w:r>
+        <w:rPr>
+          <w:b/>
+        </w:rPr>
+        <w:t xml:space="preserve">14. </w:t>
+      </w:r>
+      <w:r>
+        <w:t>In Settings, Danger zone, Delete account, the reviewer enters the disposable email address and the word DELETE, then completes both native confirmation dialogs.</w:t>
+      </w:r>
+    </w:p>
+    <w:p>
+      <w:pPr>
+        <w:spacing w:after="100"/>
+        <w:ind w:left="259" w:hanging="259"/>
+      </w:pPr>
+      <w:r>
+        <w:rPr>
+          <w:b/>
+        </w:rPr>
+        <w:t xml:space="preserve">15. </w:t>
+      </w:r>
+      <w:r>
+        <w:t>The app returns to the Sign in screen, confirming completion of the permanent account-deletion flow. The recording ends at this point.</w:t>
+      </w:r>
+    </w:p>
+    <w:p>
+      <w:pPr>
+        <w:spacing w:before="80"/>
+      </w:pPr>
+      <w:r>
+        <w:rPr>
+          <w:b/>
+        </w:rPr>
+        <w:t xml:space="preserve">What the recording confirms: </w:t>
+      </w:r>
+      <w:r>
+        <w:t>the submitted iOS app provides authenticated access to an existing NeuroTrader membership without in-app commerce; all displayed review data is synthetic; journals, notebook entries, screenshots, and AI conversations are private; and permanent account deletion is available inside the app. The product has no public feed or public user-generated content, so public reporting and blocking mechanisms do not apply.</w:t>
       </w:r>
     </w:p>
     <w:p>
@@ -290,126 +495,6 @@
       </w:pPr>
       <w:r>
         <w:t>3 Setup access and main feature instructions</w:t>
-      </w:r>
-    </w:p>
-    <w:p>
-      <w:pPr>
-        <w:spacing w:after="100"/>
-        <w:ind w:left="259" w:hanging="259"/>
-      </w:pPr>
-      <w:r>
-        <w:rPr>
-          <w:b/>
-        </w:rPr>
-        <w:t xml:space="preserve">1. </w:t>
-      </w:r>
-      <w:r>
-        <w:t>Install and launch the latest submitted build. No sample-file upload is required.</w:t>
-      </w:r>
-    </w:p>
-    <w:p>
-      <w:pPr>
-        <w:spacing w:after="100"/>
-        <w:ind w:left="259" w:hanging="259"/>
-      </w:pPr>
-      <w:r>
-        <w:rPr>
-          <w:b/>
-        </w:rPr>
-        <w:t xml:space="preserve">2. </w:t>
-      </w:r>
-      <w:r>
-        <w:t>At Sign in, use the main review email appreview@neurotrader-journal.com and the password entered in App Store Connect Review Notes.</w:t>
-      </w:r>
-    </w:p>
-    <w:p>
-      <w:pPr>
-        <w:spacing w:after="100"/>
-        <w:ind w:left="259" w:hanging="259"/>
-      </w:pPr>
-      <w:r>
-        <w:rPr>
-          <w:b/>
-        </w:rPr>
-        <w:t xml:space="preserve">3. </w:t>
-      </w:r>
-      <w:r>
-        <w:t>Business Center opens with the preloaded Two-Year Growth Demo personal account.</w:t>
-      </w:r>
-    </w:p>
-    <w:p>
-      <w:pPr>
-        <w:spacing w:after="100"/>
-        <w:ind w:left="259" w:hanging="259"/>
-      </w:pPr>
-      <w:r>
-        <w:rPr>
-          <w:b/>
-        </w:rPr>
-        <w:t xml:space="preserve">4. </w:t>
-      </w:r>
-      <w:r>
-        <w:t>Open Trading Business Plan to review the simulated $10,000 starting balance, $250,000 target, two-year dates, risk limits, checkpoints, and completed-cycle continuation recommendation.</w:t>
-      </w:r>
-    </w:p>
-    <w:p>
-      <w:pPr>
-        <w:spacing w:after="100"/>
-        <w:ind w:left="259" w:hanging="259"/>
-      </w:pPr>
-      <w:r>
-        <w:rPr>
-          <w:b/>
-        </w:rPr>
-        <w:t xml:space="preserve">5. </w:t>
-      </w:r>
-      <w:r>
-        <w:t>Open P&amp;L and September 7, 2026 in Execution Journal to inspect populated stock, listed option-contract, crypto, and forex transactions.</w:t>
-      </w:r>
-    </w:p>
-    <w:p>
-      <w:pPr>
-        <w:spacing w:after="100"/>
-        <w:ind w:left="259" w:hanging="259"/>
-      </w:pPr>
-      <w:r>
-        <w:rPr>
-          <w:b/>
-        </w:rPr>
-        <w:t xml:space="preserve">6. </w:t>
-      </w:r>
-      <w:r>
-        <w:t>Open KPIs, Business Notebook, and Coach. A suggested coach question is Analyze my two-year plan objectively.</w:t>
-      </w:r>
-    </w:p>
-    <w:p>
-      <w:pPr>
-        <w:spacing w:after="100"/>
-        <w:ind w:left="259" w:hanging="259"/>
-      </w:pPr>
-      <w:r>
-        <w:rPr>
-          <w:b/>
-        </w:rPr>
-        <w:t xml:space="preserve">7. </w:t>
-      </w:r>
-      <w:r>
-        <w:t>Open Settings to inspect notification consent, Privacy Policy, Terms and Conditions, support, sign out, workspace reset, and permanent account deletion.</w:t>
-      </w:r>
-    </w:p>
-    <w:p>
-      <w:pPr>
-        <w:spacing w:after="100"/>
-        <w:ind w:left="259" w:hanging="259"/>
-      </w:pPr>
-      <w:r>
-        <w:rPr>
-          <w:b/>
-        </w:rPr>
-        <w:t xml:space="preserve">8. </w:t>
-      </w:r>
-      <w:r>
-        <w:t>For deletion testing, sign out and use appreview-delete@neurotrader-journal.com with the same review password. Complete the Delete account flow in Settings.</w:t>
       </w:r>
     </w:p>
     <w:tbl>
@@ -478,6 +563,44 @@
               <w:rPr>
                 <w:b/>
               </w:rPr>
+              <w:t>Main review password</w:t>
+            </w:r>
+          </w:p>
+        </w:tc>
+        <w:tc>
+          <w:tcPr>
+            <w:tcW w:type="dxa" w:w="5112"/>
+            <w:tcMar>
+              <w:top w:w="100" w:type="dxa"/>
+              <w:start w:w="120" w:type="dxa"/>
+              <w:bottom w:w="100" w:type="dxa"/>
+              <w:end w:w="120" w:type="dxa"/>
+            </w:tcMar>
+          </w:tcPr>
+          <w:p>
+            <w:r>
+              <w:t>UxjsjvB0ZFimdxdwbAzNci26</w:t>
+            </w:r>
+          </w:p>
+        </w:tc>
+      </w:tr>
+      <w:tr>
+        <w:tc>
+          <w:tcPr>
+            <w:tcW w:type="dxa" w:w="5112"/>
+            <w:tcMar>
+              <w:top w:w="100" w:type="dxa"/>
+              <w:start w:w="120" w:type="dxa"/>
+              <w:bottom w:w="100" w:type="dxa"/>
+              <w:end w:w="120" w:type="dxa"/>
+            </w:tcMar>
+            <w:shd w:fill="ECFDF5"/>
+          </w:tcPr>
+          <w:p>
+            <w:r>
+              <w:rPr>
+                <w:b/>
+              </w:rPr>
               <w:t>Deletion test email</w:t>
             </w:r>
           </w:p>
@@ -516,7 +639,7 @@
               <w:rPr>
                 <w:b/>
               </w:rPr>
-              <w:t>Password</w:t>
+              <w:t>Deletion test password</w:t>
             </w:r>
           </w:p>
         </w:tc>
@@ -532,7 +655,7 @@
           </w:tcPr>
           <w:p>
             <w:r>
-              <w:t>Enter the Keychain-stored review password in App Store Connect only</w:t>
+              <w:t>UxjsjvB0ZFimdxdwbAzNci26</w:t>
             </w:r>
           </w:p>
         </w:tc>
@@ -576,6 +699,126 @@
         </w:tc>
       </w:tr>
     </w:tbl>
+    <w:p>
+      <w:pPr>
+        <w:spacing w:after="100"/>
+        <w:ind w:left="259" w:hanging="259"/>
+      </w:pPr>
+      <w:r>
+        <w:rPr>
+          <w:b/>
+        </w:rPr>
+        <w:t xml:space="preserve">1. </w:t>
+      </w:r>
+      <w:r>
+        <w:t>Install and launch the latest submitted build. No sample-file upload is required.</w:t>
+      </w:r>
+    </w:p>
+    <w:p>
+      <w:pPr>
+        <w:spacing w:after="100"/>
+        <w:ind w:left="259" w:hanging="259"/>
+      </w:pPr>
+      <w:r>
+        <w:rPr>
+          <w:b/>
+        </w:rPr>
+        <w:t xml:space="preserve">2. </w:t>
+      </w:r>
+      <w:r>
+        <w:t>At Sign in, use the main review email appreview@neurotrader-journal.com and password UxjsjvB0ZFimdxdwbAzNci26.</w:t>
+      </w:r>
+    </w:p>
+    <w:p>
+      <w:pPr>
+        <w:spacing w:after="100"/>
+        <w:ind w:left="259" w:hanging="259"/>
+      </w:pPr>
+      <w:r>
+        <w:rPr>
+          <w:b/>
+        </w:rPr>
+        <w:t xml:space="preserve">3. </w:t>
+      </w:r>
+      <w:r>
+        <w:t>Business Center opens with the preloaded Two-Year Growth Demo personal account.</w:t>
+      </w:r>
+    </w:p>
+    <w:p>
+      <w:pPr>
+        <w:spacing w:after="100"/>
+        <w:ind w:left="259" w:hanging="259"/>
+      </w:pPr>
+      <w:r>
+        <w:rPr>
+          <w:b/>
+        </w:rPr>
+        <w:t xml:space="preserve">4. </w:t>
+      </w:r>
+      <w:r>
+        <w:t>Open Trading Business Plan to review the simulated $10,000 starting balance, $250,000 target, two-year dates, risk limits, checkpoints, and completed-cycle continuation recommendation.</w:t>
+      </w:r>
+    </w:p>
+    <w:p>
+      <w:pPr>
+        <w:spacing w:after="100"/>
+        <w:ind w:left="259" w:hanging="259"/>
+      </w:pPr>
+      <w:r>
+        <w:rPr>
+          <w:b/>
+        </w:rPr>
+        <w:t xml:space="preserve">5. </w:t>
+      </w:r>
+      <w:r>
+        <w:t>Open P&amp;L and September 10, 2026 in Execution Journal to inspect populated stock, listed option-contract, crypto, and forex transactions.</w:t>
+      </w:r>
+    </w:p>
+    <w:p>
+      <w:pPr>
+        <w:spacing w:after="100"/>
+        <w:ind w:left="259" w:hanging="259"/>
+      </w:pPr>
+      <w:r>
+        <w:rPr>
+          <w:b/>
+        </w:rPr>
+        <w:t xml:space="preserve">6. </w:t>
+      </w:r>
+      <w:r>
+        <w:t>Open KPIs, Business Notebook, and Coach. A suggested coach question is Analyze my two-year plan objectively.</w:t>
+      </w:r>
+    </w:p>
+    <w:p>
+      <w:pPr>
+        <w:spacing w:after="100"/>
+        <w:ind w:left="259" w:hanging="259"/>
+      </w:pPr>
+      <w:r>
+        <w:rPr>
+          <w:b/>
+        </w:rPr>
+        <w:t xml:space="preserve">7. </w:t>
+      </w:r>
+      <w:r>
+        <w:t>Open Settings to inspect notification consent, Privacy Policy, Terms and Conditions, support, sign out, workspace reset, and permanent account deletion.</w:t>
+      </w:r>
+    </w:p>
+    <w:p>
+      <w:pPr>
+        <w:spacing w:after="100"/>
+        <w:ind w:left="259" w:hanging="259"/>
+      </w:pPr>
+      <w:r>
+        <w:rPr>
+          <w:b/>
+        </w:rPr>
+        <w:t xml:space="preserve">8. </w:t>
+      </w:r>
+      <w:r>
+        <w:t>For deletion testing, sign out and use appreview-delete@neurotrader-journal.com with password UxjsjvB0ZFimdxdwbAzNci26. Complete the Delete account flow in Settings.</w:t>
+      </w:r>
+    </w:p>
     <w:p>
       <w:pPr>
         <w:pStyle w:val="Heading1"/>
@@ -733,21 +976,6 @@
       </w:pPr>
       <w:r>
         <w:t>All preloaded balances, trades, journals, metrics, and outcomes are synthetic and labeled for demonstration and App Review only.</w:t>
-      </w:r>
-    </w:p>
-    <w:p>
-      <w:pPr>
-        <w:spacing w:before="200"/>
-      </w:pPr>
-      <w:r>
-        <w:rPr>
-          <w:b/>
-        </w:rPr>
-        <w:t>Submitted by SG PAX Corp</w:t>
-        <w:br/>
-      </w:r>
-      <w:r>
-        <w:t>NeuroTrader Product Team</w:t>
       </w:r>
     </w:p>
     <w:sectPr>

</xml_diff>